<commit_message>
revisions protocol and imports' files
</commit_message>
<xml_diff>
--- a/ClimOO material/ClimOO development protocol/ClimOO Development Protocol.docx
+++ b/ClimOO material/ClimOO development protocol/ClimOO Development Protocol.docx
@@ -9,15 +9,2204 @@
           <w:rFonts w:ascii="Calibri" w:hAnsi="Calibri" w:cs="Calibri"/>
           <w:b/>
           <w:bCs/>
-        </w:rPr>
-      </w:pPr>
+          <w:sz w:val="32"/>
+          <w:szCs w:val="32"/>
+          <w:u w:val="single"/>
+          <w:lang w:val="en-US"/>
+        </w:rPr>
+      </w:pPr>
+      <w:proofErr w:type="spellStart"/>
       <w:r>
         <w:rPr>
           <w:rFonts w:ascii="Calibri" w:hAnsi="Calibri" w:cs="Calibri"/>
           <w:b/>
           <w:bCs/>
-        </w:rPr>
-        <w:t>ClimOO Development Protocol</w:t>
+          <w:sz w:val="32"/>
+          <w:szCs w:val="32"/>
+          <w:u w:val="single"/>
+          <w:lang w:val="en-US"/>
+        </w:rPr>
+        <w:t>ClimOO</w:t>
+      </w:r>
+      <w:proofErr w:type="spellEnd"/>
+      <w:r>
+        <w:rPr>
+          <w:rFonts w:ascii="Calibri" w:hAnsi="Calibri" w:cs="Calibri"/>
+          <w:b/>
+          <w:bCs/>
+          <w:sz w:val="32"/>
+          <w:szCs w:val="32"/>
+          <w:u w:val="single"/>
+          <w:lang w:val="en-US"/>
+        </w:rPr>
+        <w:t xml:space="preserve"> Development Protocol</w:t>
+      </w:r>
+    </w:p>
+    <w:p>
+      <w:pPr>
+        <w:rPr>
+          <w:rFonts w:ascii="Calibri" w:hAnsi="Calibri" w:cs="Calibri"/>
+          <w:b/>
+          <w:bCs/>
+          <w:sz w:val="32"/>
+          <w:szCs w:val="32"/>
+          <w:u w:val="single"/>
+          <w:lang w:val="en-US"/>
+        </w:rPr>
+      </w:pPr>
+    </w:p>
+    <w:p>
+      <w:pPr>
+        <w:pStyle w:val="Titolo1"/>
+        <w:rPr>
+          <w:rFonts w:ascii="Calibri" w:hAnsi="Calibri" w:cs="Calibri"/>
+          <w:sz w:val="26"/>
+          <w:szCs w:val="26"/>
+          <w:lang w:val="en-US"/>
+        </w:rPr>
+      </w:pPr>
+      <w:r>
+        <w:rPr>
+          <w:rFonts w:ascii="Calibri" w:hAnsi="Calibri" w:cs="Calibri"/>
+          <w:sz w:val="26"/>
+          <w:szCs w:val="26"/>
+          <w:lang w:val="en-US"/>
+        </w:rPr>
+        <w:t>Aim</w:t>
+      </w:r>
+    </w:p>
+    <w:p>
+      <w:pPr>
+        <w:spacing w:line="360" w:lineRule="auto"/>
+        <w:jc w:val="both"/>
+        <w:rPr>
+          <w:rFonts w:ascii="Calibri" w:eastAsia="Calibri" w:hAnsi="Calibri" w:cs="Calibri"/>
+          <w:kern w:val="24"/>
+          <w:sz w:val="22"/>
+          <w:szCs w:val="22"/>
+          <w:lang w:val="en-US" w:eastAsia="it-IT"/>
+          <w14:ligatures w14:val="none"/>
+        </w:rPr>
+      </w:pPr>
+      <w:r>
+        <w:rPr>
+          <w:rFonts w:ascii="Calibri" w:hAnsi="Calibri" w:cs="Calibri"/>
+          <w:sz w:val="22"/>
+          <w:szCs w:val="22"/>
+          <w:lang w:val="en-US"/>
+        </w:rPr>
+        <w:t>To</w:t>
+      </w:r>
+      <w:r>
+        <w:rPr>
+          <w:rFonts w:ascii="Calibri" w:eastAsia="Calibri" w:hAnsi="Calibri" w:cs="Calibri"/>
+          <w:kern w:val="24"/>
+          <w:sz w:val="22"/>
+          <w:szCs w:val="22"/>
+          <w:lang w:val="en-US" w:eastAsia="it-IT"/>
+          <w14:ligatures w14:val="none"/>
+        </w:rPr>
+        <w:t xml:space="preserve"> develop an ontology that can assist data integration within the </w:t>
+      </w:r>
+      <w:hyperlink r:id="rId5" w:history="1">
+        <w:r>
+          <w:rPr>
+            <w:rStyle w:val="Collegamentoipertestuale"/>
+            <w:rFonts w:ascii="Calibri" w:hAnsi="Calibri" w:cs="Calibri"/>
+            <w:sz w:val="22"/>
+            <w:szCs w:val="22"/>
+            <w:lang w:val="en-US"/>
+          </w:rPr>
+          <w:t xml:space="preserve">“Climate, Plastics and Sustainability: Ontology and </w:t>
+        </w:r>
+        <w:proofErr w:type="spellStart"/>
+        <w:r>
+          <w:rPr>
+            <w:rStyle w:val="Collegamentoipertestuale"/>
+            <w:rFonts w:ascii="Calibri" w:hAnsi="Calibri" w:cs="Calibri"/>
+            <w:sz w:val="22"/>
+            <w:szCs w:val="22"/>
+            <w:lang w:val="en-US"/>
+          </w:rPr>
+          <w:t>Operationalisation</w:t>
+        </w:r>
+        <w:proofErr w:type="spellEnd"/>
+        <w:r>
+          <w:rPr>
+            <w:rStyle w:val="Collegamentoipertestuale"/>
+            <w:rFonts w:ascii="Calibri" w:hAnsi="Calibri" w:cs="Calibri"/>
+            <w:sz w:val="22"/>
+            <w:szCs w:val="22"/>
+            <w:lang w:val="en-US"/>
+          </w:rPr>
+          <w:t xml:space="preserve"> (</w:t>
+        </w:r>
+        <w:proofErr w:type="spellStart"/>
+        <w:r>
+          <w:rPr>
+            <w:rStyle w:val="Collegamentoipertestuale"/>
+            <w:rFonts w:ascii="Calibri" w:hAnsi="Calibri" w:cs="Calibri"/>
+            <w:sz w:val="22"/>
+            <w:szCs w:val="22"/>
+            <w:lang w:val="en-US"/>
+          </w:rPr>
+          <w:t>ClimOO</w:t>
+        </w:r>
+        <w:proofErr w:type="spellEnd"/>
+        <w:r>
+          <w:rPr>
+            <w:rStyle w:val="Collegamentoipertestuale"/>
+            <w:rFonts w:ascii="Calibri" w:hAnsi="Calibri" w:cs="Calibri"/>
+            <w:sz w:val="22"/>
+            <w:szCs w:val="22"/>
+            <w:lang w:val="en-US"/>
+          </w:rPr>
+          <w:t>)</w:t>
+        </w:r>
+        <w:r>
+          <w:rPr>
+            <w:rStyle w:val="Collegamentoipertestuale"/>
+            <w:rFonts w:ascii="Calibri" w:hAnsi="Calibri" w:cs="Calibri"/>
+            <w:sz w:val="22"/>
+            <w:szCs w:val="22"/>
+            <w:lang w:val="en-US"/>
+          </w:rPr>
+          <w:t xml:space="preserve">” </w:t>
+        </w:r>
+        <w:r>
+          <w:rPr>
+            <w:rStyle w:val="Collegamentoipertestuale"/>
+            <w:rFonts w:ascii="Calibri" w:hAnsi="Calibri" w:cs="Calibri"/>
+            <w:sz w:val="22"/>
+            <w:szCs w:val="22"/>
+            <w:lang w:val="en-US"/>
+          </w:rPr>
+          <w:t>project</w:t>
+        </w:r>
+        <w:r>
+          <w:rPr>
+            <w:rStyle w:val="Collegamentoipertestuale"/>
+            <w:rFonts w:ascii="Calibri" w:eastAsia="Calibri" w:hAnsi="Calibri" w:cs="Calibri"/>
+            <w:kern w:val="24"/>
+            <w:sz w:val="22"/>
+            <w:szCs w:val="22"/>
+            <w:lang w:val="en-US" w:eastAsia="it-IT"/>
+            <w14:ligatures w14:val="none"/>
+          </w:rPr>
+          <w:t>.</w:t>
+        </w:r>
+      </w:hyperlink>
+      <w:r>
+        <w:rPr>
+          <w:rFonts w:ascii="Calibri" w:eastAsia="Calibri" w:hAnsi="Calibri" w:cs="Calibri"/>
+          <w:kern w:val="24"/>
+          <w:sz w:val="22"/>
+          <w:szCs w:val="22"/>
+          <w:lang w:val="en-US" w:eastAsia="it-IT"/>
+          <w14:ligatures w14:val="none"/>
+        </w:rPr>
+        <w:t xml:space="preserve"> </w:t>
+      </w:r>
+      <w:proofErr w:type="spellStart"/>
+      <w:r>
+        <w:rPr>
+          <w:rFonts w:ascii="Calibri" w:eastAsia="Calibri" w:hAnsi="Calibri" w:cs="Calibri"/>
+          <w:kern w:val="24"/>
+          <w:sz w:val="22"/>
+          <w:szCs w:val="22"/>
+          <w:lang w:val="en-US" w:eastAsia="it-IT"/>
+          <w14:ligatures w14:val="none"/>
+        </w:rPr>
+        <w:t>ClimOO</w:t>
+      </w:r>
+      <w:proofErr w:type="spellEnd"/>
+      <w:r>
+        <w:rPr>
+          <w:rFonts w:ascii="Calibri" w:eastAsia="Calibri" w:hAnsi="Calibri" w:cs="Calibri"/>
+          <w:kern w:val="24"/>
+          <w:sz w:val="22"/>
+          <w:szCs w:val="22"/>
+          <w:lang w:val="en-US" w:eastAsia="it-IT"/>
+          <w14:ligatures w14:val="none"/>
+        </w:rPr>
+        <w:t xml:space="preserve"> project </w:t>
+      </w:r>
+      <w:r>
+        <w:rPr>
+          <w:rFonts w:ascii="Calibri" w:hAnsi="Calibri" w:cs="Calibri"/>
+          <w:sz w:val="22"/>
+          <w:szCs w:val="22"/>
+          <w:lang w:val="en-US"/>
+        </w:rPr>
+        <w:t xml:space="preserve">funded by the Autonomous Province Bolzano–South Tyrol as part of the South Tyrol 2040 climate plan. </w:t>
+      </w:r>
+    </w:p>
+    <w:p>
+      <w:pPr>
+        <w:spacing w:line="360" w:lineRule="auto"/>
+        <w:jc w:val="both"/>
+        <w:rPr>
+          <w:rFonts w:ascii="Calibri" w:hAnsi="Calibri" w:cs="Calibri"/>
+          <w:sz w:val="22"/>
+          <w:szCs w:val="22"/>
+          <w:lang w:val="en-US"/>
+        </w:rPr>
+      </w:pPr>
+      <w:r>
+        <w:rPr>
+          <w:rFonts w:ascii="Calibri" w:hAnsi="Calibri" w:cs="Calibri"/>
+          <w:sz w:val="22"/>
+          <w:szCs w:val="22"/>
+          <w:lang w:val="en-US"/>
+        </w:rPr>
+        <w:t>Involved partners:</w:t>
+      </w:r>
+    </w:p>
+    <w:p>
+      <w:pPr>
+        <w:numPr>
+          <w:ilvl w:val="0"/>
+          <w:numId w:val="2"/>
+        </w:numPr>
+        <w:spacing w:line="360" w:lineRule="auto"/>
+        <w:jc w:val="both"/>
+        <w:rPr>
+          <w:rFonts w:ascii="Calibri" w:hAnsi="Calibri" w:cs="Calibri"/>
+          <w:sz w:val="22"/>
+          <w:szCs w:val="22"/>
+        </w:rPr>
+      </w:pPr>
+      <w:hyperlink r:id="rId6" w:history="1">
+        <w:r>
+          <w:rPr>
+            <w:rStyle w:val="Collegamentoipertestuale"/>
+            <w:rFonts w:ascii="Calibri" w:hAnsi="Calibri" w:cs="Calibri"/>
+            <w:sz w:val="22"/>
+            <w:szCs w:val="22"/>
+          </w:rPr>
+          <w:t>PTH Brixen College (PTH)</w:t>
+        </w:r>
+      </w:hyperlink>
+    </w:p>
+    <w:p>
+      <w:pPr>
+        <w:numPr>
+          <w:ilvl w:val="0"/>
+          <w:numId w:val="2"/>
+        </w:numPr>
+        <w:spacing w:line="360" w:lineRule="auto"/>
+        <w:jc w:val="both"/>
+        <w:rPr>
+          <w:rFonts w:ascii="Calibri" w:hAnsi="Calibri" w:cs="Calibri"/>
+          <w:sz w:val="22"/>
+          <w:szCs w:val="22"/>
+        </w:rPr>
+      </w:pPr>
+      <w:hyperlink r:id="rId7" w:history="1">
+        <w:r>
+          <w:rPr>
+            <w:rStyle w:val="Collegamentoipertestuale"/>
+            <w:rFonts w:ascii="Calibri" w:hAnsi="Calibri" w:cs="Calibri"/>
+            <w:sz w:val="22"/>
+            <w:szCs w:val="22"/>
+          </w:rPr>
+          <w:t xml:space="preserve">Eco </w:t>
+        </w:r>
+        <w:proofErr w:type="spellStart"/>
+        <w:r>
+          <w:rPr>
+            <w:rStyle w:val="Collegamentoipertestuale"/>
+            <w:rFonts w:ascii="Calibri" w:hAnsi="Calibri" w:cs="Calibri"/>
+            <w:sz w:val="22"/>
+            <w:szCs w:val="22"/>
+          </w:rPr>
+          <w:t>Research</w:t>
+        </w:r>
+        <w:proofErr w:type="spellEnd"/>
+        <w:r>
+          <w:rPr>
+            <w:rStyle w:val="Collegamentoipertestuale"/>
+            <w:rFonts w:ascii="Calibri" w:hAnsi="Calibri" w:cs="Calibri"/>
+            <w:sz w:val="22"/>
+            <w:szCs w:val="22"/>
+          </w:rPr>
+          <w:t xml:space="preserve"> (ER)</w:t>
+        </w:r>
+      </w:hyperlink>
+    </w:p>
+    <w:p>
+      <w:pPr>
+        <w:numPr>
+          <w:ilvl w:val="0"/>
+          <w:numId w:val="2"/>
+        </w:numPr>
+        <w:spacing w:line="360" w:lineRule="auto"/>
+        <w:jc w:val="both"/>
+        <w:rPr>
+          <w:rFonts w:ascii="Calibri" w:hAnsi="Calibri" w:cs="Calibri"/>
+          <w:sz w:val="22"/>
+          <w:szCs w:val="22"/>
+        </w:rPr>
+      </w:pPr>
+      <w:hyperlink r:id="rId8" w:history="1">
+        <w:proofErr w:type="spellStart"/>
+        <w:r>
+          <w:rPr>
+            <w:rStyle w:val="Collegamentoipertestuale"/>
+            <w:rFonts w:ascii="Calibri" w:hAnsi="Calibri" w:cs="Calibri"/>
+            <w:sz w:val="22"/>
+            <w:szCs w:val="22"/>
+          </w:rPr>
+          <w:t>Laimburg</w:t>
+        </w:r>
+        <w:proofErr w:type="spellEnd"/>
+        <w:r>
+          <w:rPr>
+            <w:rStyle w:val="Collegamentoipertestuale"/>
+            <w:rFonts w:ascii="Calibri" w:hAnsi="Calibri" w:cs="Calibri"/>
+            <w:sz w:val="22"/>
+            <w:szCs w:val="22"/>
+          </w:rPr>
+          <w:t xml:space="preserve"> </w:t>
+        </w:r>
+        <w:proofErr w:type="spellStart"/>
+        <w:r>
+          <w:rPr>
+            <w:rStyle w:val="Collegamentoipertestuale"/>
+            <w:rFonts w:ascii="Calibri" w:hAnsi="Calibri" w:cs="Calibri"/>
+            <w:sz w:val="22"/>
+            <w:szCs w:val="22"/>
+          </w:rPr>
+          <w:t>Research</w:t>
+        </w:r>
+        <w:proofErr w:type="spellEnd"/>
+        <w:r>
+          <w:rPr>
+            <w:rStyle w:val="Collegamentoipertestuale"/>
+            <w:rFonts w:ascii="Calibri" w:hAnsi="Calibri" w:cs="Calibri"/>
+            <w:sz w:val="22"/>
+            <w:szCs w:val="22"/>
+          </w:rPr>
+          <w:t xml:space="preserve"> Centre (LRC)</w:t>
+        </w:r>
+      </w:hyperlink>
+    </w:p>
+    <w:p>
+      <w:pPr>
+        <w:numPr>
+          <w:ilvl w:val="0"/>
+          <w:numId w:val="2"/>
+        </w:numPr>
+        <w:spacing w:line="360" w:lineRule="auto"/>
+        <w:jc w:val="both"/>
+        <w:rPr>
+          <w:rFonts w:ascii="Calibri" w:hAnsi="Calibri" w:cs="Calibri"/>
+          <w:sz w:val="22"/>
+          <w:szCs w:val="22"/>
+        </w:rPr>
+      </w:pPr>
+      <w:hyperlink r:id="rId9" w:history="1">
+        <w:r>
+          <w:rPr>
+            <w:rStyle w:val="Collegamentoipertestuale"/>
+            <w:rFonts w:ascii="Calibri" w:hAnsi="Calibri" w:cs="Calibri"/>
+            <w:sz w:val="22"/>
+            <w:szCs w:val="22"/>
+          </w:rPr>
+          <w:t>Fraunhofer Italia (FHI)</w:t>
+        </w:r>
+      </w:hyperlink>
+    </w:p>
+    <w:p>
+      <w:pPr>
+        <w:pStyle w:val="Titolo1"/>
+        <w:rPr>
+          <w:rFonts w:ascii="Calibri" w:hAnsi="Calibri" w:cs="Calibri"/>
+          <w:sz w:val="26"/>
+          <w:szCs w:val="26"/>
+          <w:lang w:val="en-US"/>
+        </w:rPr>
+      </w:pPr>
+      <w:proofErr w:type="spellStart"/>
+      <w:r>
+        <w:rPr>
+          <w:rFonts w:ascii="Calibri" w:hAnsi="Calibri" w:cs="Calibri"/>
+          <w:sz w:val="26"/>
+          <w:szCs w:val="26"/>
+          <w:lang w:val="en-US"/>
+        </w:rPr>
+        <w:t>ClimOO</w:t>
+      </w:r>
+      <w:proofErr w:type="spellEnd"/>
+      <w:r>
+        <w:rPr>
+          <w:rFonts w:ascii="Calibri" w:hAnsi="Calibri" w:cs="Calibri"/>
+          <w:sz w:val="26"/>
+          <w:szCs w:val="26"/>
+          <w:lang w:val="en-US"/>
+        </w:rPr>
+        <w:t xml:space="preserve"> Ontology</w:t>
+      </w:r>
+      <w:r>
+        <w:rPr>
+          <w:rFonts w:ascii="Calibri" w:hAnsi="Calibri" w:cs="Calibri"/>
+          <w:sz w:val="26"/>
+          <w:szCs w:val="26"/>
+          <w:lang w:val="en-US"/>
+        </w:rPr>
+        <w:t xml:space="preserve"> Description</w:t>
+      </w:r>
+    </w:p>
+    <w:p>
+      <w:pPr>
+        <w:spacing w:line="360" w:lineRule="auto"/>
+        <w:jc w:val="both"/>
+        <w:rPr>
+          <w:rFonts w:ascii="Calibri" w:hAnsi="Calibri" w:cs="Calibri"/>
+          <w:sz w:val="22"/>
+          <w:szCs w:val="22"/>
+          <w:lang w:val="en-US"/>
+        </w:rPr>
+      </w:pPr>
+      <w:r>
+        <w:rPr>
+          <w:rFonts w:ascii="Calibri" w:hAnsi="Calibri" w:cs="Calibri"/>
+          <w:sz w:val="22"/>
+          <w:szCs w:val="22"/>
+          <w:lang w:val="en-US"/>
+        </w:rPr>
+        <w:t xml:space="preserve">The </w:t>
+      </w:r>
+      <w:proofErr w:type="spellStart"/>
+      <w:r>
+        <w:rPr>
+          <w:rFonts w:ascii="Calibri" w:hAnsi="Calibri" w:cs="Calibri"/>
+          <w:sz w:val="22"/>
+          <w:szCs w:val="22"/>
+          <w:lang w:val="en-US"/>
+        </w:rPr>
+        <w:t>ClimOO</w:t>
+      </w:r>
+      <w:proofErr w:type="spellEnd"/>
+      <w:r>
+        <w:rPr>
+          <w:rFonts w:ascii="Calibri" w:hAnsi="Calibri" w:cs="Calibri"/>
+          <w:sz w:val="22"/>
+          <w:szCs w:val="22"/>
+          <w:lang w:val="en-US"/>
+        </w:rPr>
+        <w:t xml:space="preserve"> Ontology is a domain ontology, modeling </w:t>
+      </w:r>
+      <w:r>
+        <w:rPr>
+          <w:rFonts w:ascii="Calibri" w:hAnsi="Calibri" w:cs="Calibri"/>
+          <w:sz w:val="22"/>
+          <w:szCs w:val="22"/>
+          <w:lang w:val="en-US"/>
+        </w:rPr>
+        <w:t xml:space="preserve">(micro-)plastic pollution and </w:t>
+      </w:r>
+      <w:r>
+        <w:rPr>
+          <w:rFonts w:ascii="Calibri" w:hAnsi="Calibri" w:cs="Calibri"/>
+          <w:sz w:val="22"/>
+          <w:szCs w:val="22"/>
+          <w:lang w:val="en-US"/>
+        </w:rPr>
+        <w:t xml:space="preserve">climate change, emphasizing on their mutual interrelation. Agriculture, especially </w:t>
+      </w:r>
+      <w:r>
+        <w:rPr>
+          <w:rFonts w:ascii="Calibri" w:hAnsi="Calibri" w:cs="Calibri"/>
+          <w:sz w:val="22"/>
+          <w:szCs w:val="22"/>
+          <w:lang w:val="en-US"/>
+        </w:rPr>
+        <w:t>local S</w:t>
+      </w:r>
+      <w:r>
+        <w:rPr>
+          <w:rFonts w:ascii="Calibri" w:hAnsi="Calibri" w:cs="Calibri"/>
+          <w:sz w:val="22"/>
+          <w:szCs w:val="22"/>
+          <w:lang w:val="en-US"/>
+        </w:rPr>
+        <w:t>outh</w:t>
+      </w:r>
+      <w:r>
+        <w:rPr>
+          <w:rFonts w:ascii="Calibri" w:hAnsi="Calibri" w:cs="Calibri"/>
+          <w:sz w:val="22"/>
+          <w:szCs w:val="22"/>
+          <w:lang w:val="en-US"/>
+        </w:rPr>
+        <w:t xml:space="preserve"> T</w:t>
+      </w:r>
+      <w:r>
+        <w:rPr>
+          <w:rFonts w:ascii="Calibri" w:hAnsi="Calibri" w:cs="Calibri"/>
+          <w:sz w:val="22"/>
+          <w:szCs w:val="22"/>
+          <w:lang w:val="en-US"/>
+        </w:rPr>
+        <w:t>yrole</w:t>
+      </w:r>
+      <w:r>
+        <w:rPr>
+          <w:rFonts w:ascii="Calibri" w:hAnsi="Calibri" w:cs="Calibri"/>
+          <w:sz w:val="22"/>
+          <w:szCs w:val="22"/>
+          <w:lang w:val="en-US"/>
+        </w:rPr>
+        <w:t>an (Italy)</w:t>
+      </w:r>
+      <w:r>
+        <w:rPr>
+          <w:rFonts w:ascii="Calibri" w:hAnsi="Calibri" w:cs="Calibri"/>
+          <w:sz w:val="22"/>
+          <w:szCs w:val="22"/>
+          <w:lang w:val="en-US"/>
+        </w:rPr>
+        <w:t xml:space="preserve"> apple production</w:t>
+      </w:r>
+      <w:r>
+        <w:rPr>
+          <w:rFonts w:ascii="Calibri" w:hAnsi="Calibri" w:cs="Calibri"/>
+          <w:sz w:val="22"/>
+          <w:szCs w:val="22"/>
+          <w:lang w:val="en-US"/>
+        </w:rPr>
+        <w:t>,</w:t>
+      </w:r>
+      <w:r>
+        <w:rPr>
+          <w:rFonts w:ascii="Calibri" w:hAnsi="Calibri" w:cs="Calibri"/>
+          <w:sz w:val="22"/>
+          <w:szCs w:val="22"/>
+          <w:lang w:val="en-US"/>
+        </w:rPr>
+        <w:t xml:space="preserve"> </w:t>
+      </w:r>
+      <w:r>
+        <w:rPr>
+          <w:rFonts w:ascii="Calibri" w:hAnsi="Calibri" w:cs="Calibri"/>
+          <w:sz w:val="22"/>
+          <w:szCs w:val="22"/>
+          <w:lang w:val="en-US"/>
+        </w:rPr>
+        <w:t>is the</w:t>
+      </w:r>
+      <w:r>
+        <w:rPr>
+          <w:rFonts w:ascii="Calibri" w:hAnsi="Calibri" w:cs="Calibri"/>
+          <w:sz w:val="22"/>
+          <w:szCs w:val="22"/>
+          <w:lang w:val="en-US"/>
+        </w:rPr>
+        <w:t xml:space="preserve"> use case of this resource.</w:t>
+      </w:r>
+      <w:r>
+        <w:rPr>
+          <w:rFonts w:ascii="Calibri" w:hAnsi="Calibri" w:cs="Calibri"/>
+          <w:sz w:val="22"/>
+          <w:szCs w:val="22"/>
+          <w:lang w:val="en-US"/>
+        </w:rPr>
+        <w:t xml:space="preserve"> </w:t>
+      </w:r>
+      <w:proofErr w:type="spellStart"/>
+      <w:r>
+        <w:rPr>
+          <w:rFonts w:ascii="Calibri" w:hAnsi="Calibri" w:cs="Calibri"/>
+          <w:sz w:val="22"/>
+          <w:szCs w:val="22"/>
+          <w:lang w:val="en-US"/>
+        </w:rPr>
+        <w:t>ClimOO</w:t>
+      </w:r>
+      <w:proofErr w:type="spellEnd"/>
+      <w:r>
+        <w:rPr>
+          <w:rFonts w:ascii="Calibri" w:hAnsi="Calibri" w:cs="Calibri"/>
+          <w:sz w:val="22"/>
+          <w:szCs w:val="22"/>
+          <w:lang w:val="en-US"/>
+        </w:rPr>
+        <w:t xml:space="preserve"> Ontology extends </w:t>
+      </w:r>
+      <w:hyperlink r:id="rId10" w:history="1">
+        <w:r>
+          <w:rPr>
+            <w:rStyle w:val="Collegamentoipertestuale"/>
+            <w:rFonts w:ascii="Calibri" w:hAnsi="Calibri" w:cs="Calibri"/>
+            <w:sz w:val="22"/>
+            <w:szCs w:val="22"/>
+            <w:lang w:val="en-US"/>
+          </w:rPr>
+          <w:t>Sustainability Core Ontology (SCO)</w:t>
+        </w:r>
+      </w:hyperlink>
+      <w:r>
+        <w:rPr>
+          <w:rFonts w:ascii="Calibri" w:hAnsi="Calibri" w:cs="Calibri"/>
+          <w:sz w:val="22"/>
+          <w:szCs w:val="22"/>
+          <w:lang w:val="en-US"/>
+        </w:rPr>
+        <w:t xml:space="preserve"> and </w:t>
+      </w:r>
+      <w:hyperlink r:id="rId11" w:history="1">
+        <w:r>
+          <w:rPr>
+            <w:rStyle w:val="Collegamentoipertestuale"/>
+            <w:rFonts w:ascii="Calibri" w:hAnsi="Calibri" w:cs="Calibri"/>
+            <w:sz w:val="22"/>
+            <w:szCs w:val="22"/>
+            <w:lang w:val="en-US"/>
+          </w:rPr>
+          <w:t>Basic Formal Ontology (BFO)</w:t>
+        </w:r>
+      </w:hyperlink>
+      <w:r>
+        <w:rPr>
+          <w:rFonts w:ascii="Calibri" w:hAnsi="Calibri" w:cs="Calibri"/>
+          <w:sz w:val="22"/>
+          <w:szCs w:val="22"/>
+          <w:lang w:val="en-US"/>
+        </w:rPr>
+        <w:t xml:space="preserve"> and build upon the </w:t>
+      </w:r>
+      <w:hyperlink r:id="rId12" w:history="1">
+        <w:r>
+          <w:rPr>
+            <w:rStyle w:val="Collegamentoipertestuale"/>
+            <w:rFonts w:ascii="Calibri" w:hAnsi="Calibri" w:cs="Calibri"/>
+            <w:sz w:val="22"/>
+            <w:szCs w:val="22"/>
+            <w:lang w:val="en-US"/>
+          </w:rPr>
+          <w:t>Food Systems Sustainability Meta-framework (FSSMF)</w:t>
+        </w:r>
+      </w:hyperlink>
+      <w:r>
+        <w:rPr>
+          <w:rFonts w:ascii="Calibri" w:hAnsi="Calibri" w:cs="Calibri"/>
+          <w:sz w:val="22"/>
+          <w:szCs w:val="22"/>
+          <w:lang w:val="en-US"/>
+        </w:rPr>
+        <w:t xml:space="preserve"> and its methodology </w:t>
+      </w:r>
+      <w:r>
+        <w:rPr>
+          <w:rFonts w:ascii="Calibri" w:hAnsi="Calibri" w:cs="Calibri"/>
+          <w:sz w:val="22"/>
+          <w:szCs w:val="22"/>
+          <w:lang w:val="en-US"/>
+        </w:rPr>
+        <w:fldChar w:fldCharType="begin"/>
+      </w:r>
+      <w:r>
+        <w:rPr>
+          <w:rFonts w:ascii="Calibri" w:hAnsi="Calibri" w:cs="Calibri"/>
+          <w:sz w:val="22"/>
+          <w:szCs w:val="22"/>
+          <w:lang w:val="en-US"/>
+        </w:rPr>
+        <w:instrText xml:space="preserve"> ADDIN ZOTERO_ITEM CSL_CITATION {"citationID":"y5iRR5zo","properties":{"formattedCitation":"(Ubbiali 2025)","plainCitation":"(Ubbiali 2025)","dontUpdate":true,"noteIndex":0},"citationItems":[{"id":4689,"uris":["http://zotero.org/users/8948421/items/IXDS7HXC"],"itemData":{"id":4689,"type":"thesis","genre":"PhD Thesis","publisher":"UNIMI","title":"Designing Foundational Strategies for Developing a Family of Food Systems Sustainability Ontologies","URL":"https://air.unimi.it/handle/2434/1161515","author":[{"family":"Ubbiali","given":"Giorgio A."}],"issued":{"date-parts":[["2025"]]}}}],"schema":"https://github.com/citation-style-language/schema/raw/master/csl-citation.json"} </w:instrText>
+      </w:r>
+      <w:r>
+        <w:rPr>
+          <w:rFonts w:ascii="Calibri" w:hAnsi="Calibri" w:cs="Calibri"/>
+          <w:sz w:val="22"/>
+          <w:szCs w:val="22"/>
+          <w:lang w:val="en-US"/>
+        </w:rPr>
+        <w:fldChar w:fldCharType="separate"/>
+      </w:r>
+      <w:r>
+        <w:rPr>
+          <w:rFonts w:ascii="Calibri" w:hAnsi="Calibri" w:cs="Calibri"/>
+          <w:noProof/>
+          <w:sz w:val="22"/>
+          <w:szCs w:val="22"/>
+          <w:lang w:val="en-US"/>
+        </w:rPr>
+        <w:t>(Ubbiali 2025)</w:t>
+      </w:r>
+      <w:r>
+        <w:rPr>
+          <w:rFonts w:ascii="Calibri" w:hAnsi="Calibri" w:cs="Calibri"/>
+          <w:sz w:val="22"/>
+          <w:szCs w:val="22"/>
+          <w:lang w:val="en-US"/>
+        </w:rPr>
+        <w:fldChar w:fldCharType="end"/>
+      </w:r>
+      <w:r>
+        <w:rPr>
+          <w:rFonts w:ascii="Calibri" w:hAnsi="Calibri" w:cs="Calibri"/>
+          <w:sz w:val="22"/>
+          <w:szCs w:val="22"/>
+          <w:lang w:val="en-US"/>
+        </w:rPr>
+        <w:t xml:space="preserve">. </w:t>
+      </w:r>
+      <w:proofErr w:type="spellStart"/>
+      <w:r>
+        <w:rPr>
+          <w:rFonts w:ascii="Calibri" w:hAnsi="Calibri" w:cs="Calibri"/>
+          <w:sz w:val="22"/>
+          <w:szCs w:val="22"/>
+          <w:lang w:val="en-US"/>
+        </w:rPr>
+        <w:t>ClimOO</w:t>
+      </w:r>
+      <w:proofErr w:type="spellEnd"/>
+      <w:r>
+        <w:rPr>
+          <w:rFonts w:ascii="Calibri" w:hAnsi="Calibri" w:cs="Calibri"/>
+          <w:sz w:val="22"/>
+          <w:szCs w:val="22"/>
+          <w:lang w:val="en-US"/>
+        </w:rPr>
+        <w:t xml:space="preserve"> Ontology also imports from several other ontological resources. See </w:t>
+      </w:r>
+      <w:commentRangeStart w:id="0"/>
+      <w:r>
+        <w:rPr>
+          <w:rFonts w:ascii="Calibri" w:hAnsi="Calibri" w:cs="Calibri"/>
+          <w:sz w:val="22"/>
+          <w:szCs w:val="22"/>
+          <w:lang w:val="en-US"/>
+        </w:rPr>
+        <w:t>here</w:t>
+      </w:r>
+      <w:commentRangeEnd w:id="0"/>
+      <w:r>
+        <w:rPr>
+          <w:rStyle w:val="Rimandocommento"/>
+        </w:rPr>
+        <w:commentReference w:id="0"/>
+      </w:r>
+      <w:r>
+        <w:rPr>
+          <w:rFonts w:ascii="Calibri" w:hAnsi="Calibri" w:cs="Calibri"/>
+          <w:sz w:val="22"/>
+          <w:szCs w:val="22"/>
+          <w:lang w:val="en-US"/>
+        </w:rPr>
+        <w:t xml:space="preserve"> for a complete list.</w:t>
+      </w:r>
+    </w:p>
+    <w:p>
+      <w:pPr>
+        <w:spacing w:line="360" w:lineRule="auto"/>
+        <w:jc w:val="both"/>
+        <w:rPr>
+          <w:rFonts w:ascii="Calibri" w:hAnsi="Calibri" w:cs="Calibri"/>
+          <w:sz w:val="22"/>
+          <w:szCs w:val="22"/>
+          <w:lang w:val="en-US"/>
+        </w:rPr>
+      </w:pPr>
+      <w:r>
+        <w:rPr>
+          <w:rFonts w:ascii="Calibri" w:hAnsi="Calibri" w:cs="Calibri"/>
+          <w:sz w:val="22"/>
+          <w:szCs w:val="22"/>
+          <w:lang w:val="en-US"/>
+        </w:rPr>
+        <w:t xml:space="preserve">This protocol briefly presents major steps covered during the design of the </w:t>
+      </w:r>
+      <w:proofErr w:type="spellStart"/>
+      <w:r>
+        <w:rPr>
+          <w:rFonts w:ascii="Calibri" w:hAnsi="Calibri" w:cs="Calibri"/>
+          <w:sz w:val="22"/>
+          <w:szCs w:val="22"/>
+          <w:lang w:val="en-US"/>
+        </w:rPr>
+        <w:t>ClimOO</w:t>
+      </w:r>
+      <w:proofErr w:type="spellEnd"/>
+      <w:r>
+        <w:rPr>
+          <w:rFonts w:ascii="Calibri" w:hAnsi="Calibri" w:cs="Calibri"/>
+          <w:sz w:val="22"/>
+          <w:szCs w:val="22"/>
+          <w:lang w:val="en-US"/>
+        </w:rPr>
+        <w:t xml:space="preserve"> Ontology.</w:t>
+      </w:r>
+      <w:r>
+        <w:rPr>
+          <w:rFonts w:ascii="Calibri" w:hAnsi="Calibri" w:cs="Calibri"/>
+          <w:sz w:val="22"/>
+          <w:szCs w:val="22"/>
+          <w:lang w:val="en-US"/>
+        </w:rPr>
+        <w:t xml:space="preserve"> Current release of </w:t>
+      </w:r>
+      <w:proofErr w:type="spellStart"/>
+      <w:r>
+        <w:rPr>
+          <w:rFonts w:ascii="Calibri" w:hAnsi="Calibri" w:cs="Calibri"/>
+          <w:sz w:val="22"/>
+          <w:szCs w:val="22"/>
+          <w:lang w:val="en-US"/>
+        </w:rPr>
+        <w:t>ClimOO</w:t>
+      </w:r>
+      <w:proofErr w:type="spellEnd"/>
+      <w:r>
+        <w:rPr>
+          <w:rFonts w:ascii="Calibri" w:hAnsi="Calibri" w:cs="Calibri"/>
+          <w:sz w:val="22"/>
+          <w:szCs w:val="22"/>
+          <w:lang w:val="en-US"/>
+        </w:rPr>
+        <w:t xml:space="preserve"> ontology is </w:t>
+      </w:r>
+      <w:proofErr w:type="spellStart"/>
+      <w:r>
+        <w:rPr>
+          <w:rFonts w:ascii="Calibri" w:hAnsi="Calibri" w:cs="Calibri"/>
+          <w:sz w:val="22"/>
+          <w:szCs w:val="22"/>
+          <w:lang w:val="en-US"/>
+        </w:rPr>
+        <w:t>ClimOO</w:t>
+      </w:r>
+      <w:proofErr w:type="spellEnd"/>
+      <w:r>
+        <w:rPr>
+          <w:rFonts w:ascii="Calibri" w:hAnsi="Calibri" w:cs="Calibri"/>
+          <w:sz w:val="22"/>
+          <w:szCs w:val="22"/>
+          <w:lang w:val="en-US"/>
+        </w:rPr>
+        <w:t xml:space="preserve"> V1.0.0.</w:t>
+      </w:r>
+      <w:r>
+        <w:rPr>
+          <w:rFonts w:ascii="Calibri" w:hAnsi="Calibri" w:cs="Calibri"/>
+          <w:sz w:val="22"/>
+          <w:szCs w:val="22"/>
+          <w:lang w:val="en-US"/>
+        </w:rPr>
+        <w:t xml:space="preserve"> </w:t>
+      </w:r>
+      <w:proofErr w:type="spellStart"/>
+      <w:r>
+        <w:rPr>
+          <w:rFonts w:ascii="Calibri" w:hAnsi="Calibri" w:cs="Calibri"/>
+          <w:sz w:val="22"/>
+          <w:szCs w:val="22"/>
+          <w:lang w:val="en-US"/>
+        </w:rPr>
+        <w:t>ClimOO</w:t>
+      </w:r>
+      <w:proofErr w:type="spellEnd"/>
+      <w:r>
+        <w:rPr>
+          <w:rFonts w:ascii="Calibri" w:hAnsi="Calibri" w:cs="Calibri"/>
+          <w:sz w:val="22"/>
+          <w:szCs w:val="22"/>
+          <w:lang w:val="en-US"/>
+        </w:rPr>
+        <w:t xml:space="preserve"> V1.0.0</w:t>
+      </w:r>
+      <w:r>
+        <w:rPr>
+          <w:rFonts w:ascii="Calibri" w:hAnsi="Calibri" w:cs="Calibri"/>
+          <w:sz w:val="22"/>
+          <w:szCs w:val="22"/>
+          <w:lang w:val="en-US"/>
+        </w:rPr>
+        <w:t xml:space="preserve"> </w:t>
+      </w:r>
+      <w:r>
+        <w:rPr>
+          <w:rFonts w:ascii="Calibri" w:hAnsi="Calibri" w:cs="Calibri"/>
+          <w:color w:val="000000" w:themeColor="text1"/>
+          <w:sz w:val="22"/>
+          <w:szCs w:val="22"/>
+          <w:lang w:val="en-US" w:eastAsia="it-IT"/>
+        </w:rPr>
+        <w:t>is formalized in </w:t>
+      </w:r>
+      <w:hyperlink r:id="rId17" w:history="1">
+        <w:r>
+          <w:rPr>
+            <w:rStyle w:val="Collegamentoipertestuale"/>
+            <w:rFonts w:ascii="Calibri" w:hAnsi="Calibri" w:cs="Calibri"/>
+            <w:color w:val="000000" w:themeColor="text1"/>
+            <w:sz w:val="22"/>
+            <w:szCs w:val="22"/>
+            <w:lang w:val="en-US" w:eastAsia="it-IT"/>
+          </w:rPr>
+          <w:t>O</w:t>
+        </w:r>
+        <w:r>
+          <w:rPr>
+            <w:rStyle w:val="Collegamentoipertestuale"/>
+            <w:rFonts w:ascii="Calibri" w:hAnsi="Calibri" w:cs="Calibri"/>
+            <w:color w:val="000000" w:themeColor="text1"/>
+            <w:sz w:val="22"/>
+            <w:szCs w:val="22"/>
+            <w:lang w:val="en-US" w:eastAsia="it-IT"/>
+          </w:rPr>
+          <w:t>W</w:t>
+        </w:r>
+        <w:r>
+          <w:rPr>
+            <w:rStyle w:val="Collegamentoipertestuale"/>
+            <w:rFonts w:ascii="Calibri" w:hAnsi="Calibri" w:cs="Calibri"/>
+            <w:color w:val="000000" w:themeColor="text1"/>
+            <w:sz w:val="22"/>
+            <w:szCs w:val="22"/>
+            <w:lang w:val="en-US" w:eastAsia="it-IT"/>
+          </w:rPr>
+          <w:t>L</w:t>
+        </w:r>
+      </w:hyperlink>
+      <w:r>
+        <w:rPr>
+          <w:rFonts w:ascii="Calibri" w:hAnsi="Calibri" w:cs="Calibri"/>
+          <w:color w:val="000000" w:themeColor="text1"/>
+          <w:sz w:val="22"/>
+          <w:szCs w:val="22"/>
+          <w:lang w:val="en-US" w:eastAsia="it-IT"/>
+        </w:rPr>
+        <w:t xml:space="preserve"> and covers </w:t>
+      </w:r>
+      <w:r>
+        <w:rPr>
+          <w:rFonts w:ascii="Calibri" w:hAnsi="Calibri" w:cs="Calibri"/>
+          <w:color w:val="000000" w:themeColor="text1"/>
+          <w:sz w:val="22"/>
+          <w:szCs w:val="22"/>
+          <w:lang w:val="en-US" w:eastAsia="it-IT"/>
+        </w:rPr>
+        <w:t xml:space="preserve">English as </w:t>
+      </w:r>
+      <w:r>
+        <w:rPr>
+          <w:rFonts w:ascii="Calibri" w:hAnsi="Calibri" w:cs="Calibri"/>
+          <w:color w:val="000000" w:themeColor="text1"/>
+          <w:sz w:val="22"/>
+          <w:szCs w:val="22"/>
+          <w:lang w:val="en-US" w:eastAsia="it-IT"/>
+        </w:rPr>
+        <w:t>natural</w:t>
+      </w:r>
+      <w:r>
+        <w:rPr>
+          <w:rFonts w:ascii="Calibri" w:hAnsi="Calibri" w:cs="Calibri"/>
+          <w:color w:val="000000" w:themeColor="text1"/>
+          <w:sz w:val="22"/>
+          <w:szCs w:val="22"/>
+          <w:lang w:val="en-US" w:eastAsia="it-IT"/>
+        </w:rPr>
+        <w:t xml:space="preserve"> language</w:t>
+      </w:r>
+      <w:r>
+        <w:rPr>
+          <w:rFonts w:ascii="Calibri" w:hAnsi="Calibri" w:cs="Calibri"/>
+          <w:color w:val="000000" w:themeColor="text1"/>
+          <w:sz w:val="22"/>
+          <w:szCs w:val="22"/>
+          <w:lang w:val="en-US" w:eastAsia="it-IT"/>
+        </w:rPr>
+        <w:t xml:space="preserve">. </w:t>
+      </w:r>
+      <w:proofErr w:type="spellStart"/>
+      <w:r>
+        <w:rPr>
+          <w:rFonts w:ascii="Calibri" w:hAnsi="Calibri" w:cs="Calibri"/>
+          <w:sz w:val="22"/>
+          <w:szCs w:val="22"/>
+          <w:lang w:val="en-US"/>
+        </w:rPr>
+        <w:t>ClimOO</w:t>
+      </w:r>
+      <w:proofErr w:type="spellEnd"/>
+      <w:r>
+        <w:rPr>
+          <w:rFonts w:ascii="Calibri" w:hAnsi="Calibri" w:cs="Calibri"/>
+          <w:sz w:val="22"/>
+          <w:szCs w:val="22"/>
+          <w:lang w:val="en-US"/>
+        </w:rPr>
+        <w:t xml:space="preserve"> V1.0.0</w:t>
+      </w:r>
+      <w:r>
+        <w:rPr>
+          <w:rFonts w:ascii="Calibri" w:hAnsi="Calibri" w:cs="Calibri"/>
+          <w:sz w:val="22"/>
+          <w:szCs w:val="22"/>
+          <w:lang w:val="en-US"/>
+        </w:rPr>
+        <w:t xml:space="preserve"> </w:t>
+      </w:r>
+      <w:r>
+        <w:rPr>
+          <w:rFonts w:ascii="Calibri" w:hAnsi="Calibri" w:cs="Calibri"/>
+          <w:color w:val="000000" w:themeColor="text1"/>
+          <w:sz w:val="22"/>
+          <w:szCs w:val="22"/>
+          <w:lang w:val="en-US" w:eastAsia="it-IT"/>
+        </w:rPr>
+        <w:t>conforms to </w:t>
+      </w:r>
+      <w:hyperlink r:id="rId18" w:history="1">
+        <w:r>
+          <w:rPr>
+            <w:rStyle w:val="Collegamentoipertestuale"/>
+            <w:rFonts w:ascii="Calibri" w:hAnsi="Calibri" w:cs="Calibri"/>
+            <w:color w:val="000000" w:themeColor="text1"/>
+            <w:sz w:val="22"/>
+            <w:szCs w:val="22"/>
+            <w:lang w:val="en-US" w:eastAsia="it-IT"/>
+          </w:rPr>
+          <w:t>OBO-Foundry p</w:t>
+        </w:r>
+        <w:r>
+          <w:rPr>
+            <w:rStyle w:val="Collegamentoipertestuale"/>
+            <w:rFonts w:ascii="Calibri" w:hAnsi="Calibri" w:cs="Calibri"/>
+            <w:color w:val="000000" w:themeColor="text1"/>
+            <w:sz w:val="22"/>
+            <w:szCs w:val="22"/>
+            <w:lang w:val="en-US" w:eastAsia="it-IT"/>
+          </w:rPr>
+          <w:t>r</w:t>
+        </w:r>
+        <w:r>
+          <w:rPr>
+            <w:rStyle w:val="Collegamentoipertestuale"/>
+            <w:rFonts w:ascii="Calibri" w:hAnsi="Calibri" w:cs="Calibri"/>
+            <w:color w:val="000000" w:themeColor="text1"/>
+            <w:sz w:val="22"/>
+            <w:szCs w:val="22"/>
+            <w:lang w:val="en-US" w:eastAsia="it-IT"/>
+          </w:rPr>
+          <w:t>inciples</w:t>
+        </w:r>
+      </w:hyperlink>
+      <w:r>
+        <w:rPr>
+          <w:rFonts w:ascii="Calibri" w:hAnsi="Calibri" w:cs="Calibri"/>
+          <w:color w:val="000000" w:themeColor="text1"/>
+          <w:sz w:val="22"/>
+          <w:szCs w:val="22"/>
+          <w:lang w:val="en-US" w:eastAsia="it-IT"/>
+        </w:rPr>
+        <w:t>.</w:t>
+      </w:r>
+      <w:r>
+        <w:rPr>
+          <w:rFonts w:ascii="Calibri" w:hAnsi="Calibri" w:cs="Calibri"/>
+          <w:color w:val="000000" w:themeColor="text1"/>
+          <w:sz w:val="22"/>
+          <w:szCs w:val="22"/>
+          <w:lang w:val="en-US" w:eastAsia="it-IT"/>
+        </w:rPr>
+        <w:t xml:space="preserve"> </w:t>
+      </w:r>
+      <w:r>
+        <w:rPr>
+          <w:rFonts w:ascii="Calibri" w:hAnsi="Calibri" w:cs="Calibri"/>
+          <w:color w:val="000000" w:themeColor="text1"/>
+          <w:sz w:val="22"/>
+          <w:szCs w:val="22"/>
+          <w:lang w:val="en-GB"/>
+        </w:rPr>
+        <w:t xml:space="preserve">The most recent version of </w:t>
+      </w:r>
+      <w:proofErr w:type="spellStart"/>
+      <w:r>
+        <w:rPr>
+          <w:rFonts w:ascii="Calibri" w:hAnsi="Calibri" w:cs="Calibri"/>
+          <w:sz w:val="22"/>
+          <w:szCs w:val="22"/>
+          <w:lang w:val="en-US"/>
+        </w:rPr>
+        <w:t>ClimOO</w:t>
+      </w:r>
+      <w:proofErr w:type="spellEnd"/>
+      <w:r>
+        <w:rPr>
+          <w:rFonts w:ascii="Calibri" w:hAnsi="Calibri" w:cs="Calibri"/>
+          <w:sz w:val="22"/>
+          <w:szCs w:val="22"/>
+          <w:lang w:val="en-US"/>
+        </w:rPr>
+        <w:t xml:space="preserve"> V1.0.0</w:t>
+      </w:r>
+      <w:r>
+        <w:rPr>
+          <w:rFonts w:ascii="Calibri" w:hAnsi="Calibri" w:cs="Calibri"/>
+          <w:sz w:val="22"/>
+          <w:szCs w:val="22"/>
+          <w:lang w:val="en-US"/>
+        </w:rPr>
+        <w:t xml:space="preserve"> </w:t>
+      </w:r>
+      <w:r>
+        <w:rPr>
+          <w:rFonts w:ascii="Calibri" w:hAnsi="Calibri" w:cs="Calibri"/>
+          <w:color w:val="000000" w:themeColor="text1"/>
+          <w:sz w:val="22"/>
+          <w:szCs w:val="22"/>
+          <w:lang w:val="en-GB"/>
+        </w:rPr>
+        <w:t>can always be found at </w:t>
+      </w:r>
+      <w:hyperlink r:id="rId19" w:history="1">
+        <w:r>
+          <w:rPr>
+            <w:rStyle w:val="Collegamentoipertestuale"/>
+            <w:rFonts w:ascii="Calibri" w:hAnsi="Calibri" w:cs="Calibri"/>
+            <w:sz w:val="22"/>
+            <w:szCs w:val="22"/>
+            <w:lang w:val="en-GB"/>
+          </w:rPr>
+          <w:t>https://w3id.or</w:t>
+        </w:r>
+        <w:r>
+          <w:rPr>
+            <w:rStyle w:val="Collegamentoipertestuale"/>
+            <w:rFonts w:ascii="Calibri" w:hAnsi="Calibri" w:cs="Calibri"/>
+            <w:sz w:val="22"/>
+            <w:szCs w:val="22"/>
+            <w:lang w:val="en-GB"/>
+          </w:rPr>
+          <w:t>g</w:t>
+        </w:r>
+        <w:r>
+          <w:rPr>
+            <w:rStyle w:val="Collegamentoipertestuale"/>
+            <w:rFonts w:ascii="Calibri" w:hAnsi="Calibri" w:cs="Calibri"/>
+            <w:sz w:val="22"/>
+            <w:szCs w:val="22"/>
+            <w:lang w:val="en-GB"/>
+          </w:rPr>
+          <w:t>/</w:t>
+        </w:r>
+        <w:r>
+          <w:rPr>
+            <w:rStyle w:val="Collegamentoipertestuale"/>
+            <w:rFonts w:ascii="Calibri" w:hAnsi="Calibri" w:cs="Calibri"/>
+            <w:sz w:val="22"/>
+            <w:szCs w:val="22"/>
+            <w:lang w:val="en-GB"/>
+          </w:rPr>
+          <w:t>climoo</w:t>
+        </w:r>
+        <w:r>
+          <w:rPr>
+            <w:rStyle w:val="Collegamentoipertestuale"/>
+            <w:rFonts w:ascii="Calibri" w:hAnsi="Calibri" w:cs="Calibri"/>
+            <w:sz w:val="22"/>
+            <w:szCs w:val="22"/>
+            <w:lang w:val="en-GB"/>
+          </w:rPr>
+          <w:t>/</w:t>
+        </w:r>
+        <w:r>
+          <w:rPr>
+            <w:rStyle w:val="Collegamentoipertestuale"/>
+            <w:rFonts w:ascii="Calibri" w:hAnsi="Calibri" w:cs="Calibri"/>
+            <w:sz w:val="22"/>
+            <w:szCs w:val="22"/>
+            <w:lang w:val="en-GB"/>
+          </w:rPr>
+          <w:t>climoo</w:t>
+        </w:r>
+      </w:hyperlink>
+      <w:r>
+        <w:rPr>
+          <w:rFonts w:ascii="Calibri" w:hAnsi="Calibri" w:cs="Calibri"/>
+          <w:color w:val="000000" w:themeColor="text1"/>
+          <w:sz w:val="22"/>
+          <w:szCs w:val="22"/>
+          <w:lang w:val="en-GB"/>
+        </w:rPr>
+        <w:t>.</w:t>
+      </w:r>
+      <w:r>
+        <w:rPr>
+          <w:rFonts w:ascii="Calibri" w:hAnsi="Calibri" w:cs="Calibri"/>
+          <w:color w:val="000000" w:themeColor="text1"/>
+          <w:sz w:val="22"/>
+          <w:szCs w:val="22"/>
+          <w:lang w:val="en-US"/>
+        </w:rPr>
+        <w:t xml:space="preserve"> </w:t>
+      </w:r>
+      <w:r>
+        <w:rPr>
+          <w:rFonts w:ascii="Calibri" w:hAnsi="Calibri" w:cs="Calibri"/>
+          <w:color w:val="000000" w:themeColor="text1"/>
+          <w:sz w:val="22"/>
+          <w:szCs w:val="22"/>
+          <w:lang w:val="en-US"/>
+        </w:rPr>
+        <w:t xml:space="preserve">The person responsible for </w:t>
+      </w:r>
+      <w:proofErr w:type="spellStart"/>
+      <w:r>
+        <w:rPr>
+          <w:rFonts w:ascii="Calibri" w:hAnsi="Calibri" w:cs="Calibri"/>
+          <w:sz w:val="22"/>
+          <w:szCs w:val="22"/>
+          <w:lang w:val="en-US"/>
+        </w:rPr>
+        <w:t>ClimOO</w:t>
+      </w:r>
+      <w:proofErr w:type="spellEnd"/>
+      <w:r>
+        <w:rPr>
+          <w:rFonts w:ascii="Calibri" w:hAnsi="Calibri" w:cs="Calibri"/>
+          <w:sz w:val="22"/>
+          <w:szCs w:val="22"/>
+          <w:lang w:val="en-US"/>
+        </w:rPr>
+        <w:t xml:space="preserve"> Ontology</w:t>
+      </w:r>
+      <w:r>
+        <w:rPr>
+          <w:rFonts w:ascii="Calibri" w:hAnsi="Calibri" w:cs="Calibri"/>
+          <w:color w:val="000000" w:themeColor="text1"/>
+          <w:sz w:val="22"/>
+          <w:szCs w:val="22"/>
+          <w:lang w:val="en-US"/>
+        </w:rPr>
+        <w:t xml:space="preserve"> is </w:t>
+      </w:r>
+      <w:hyperlink r:id="rId20" w:history="1">
+        <w:r>
+          <w:rPr>
+            <w:rStyle w:val="Collegamentoipertestuale"/>
+            <w:rFonts w:ascii="Calibri" w:hAnsi="Calibri" w:cs="Calibri"/>
+            <w:color w:val="000000" w:themeColor="text1"/>
+            <w:sz w:val="22"/>
+            <w:szCs w:val="22"/>
+            <w:lang w:val="en-US"/>
+          </w:rPr>
+          <w:t xml:space="preserve">Giorgio A. </w:t>
+        </w:r>
+        <w:proofErr w:type="spellStart"/>
+        <w:r>
+          <w:rPr>
+            <w:rStyle w:val="Collegamentoipertestuale"/>
+            <w:rFonts w:ascii="Calibri" w:hAnsi="Calibri" w:cs="Calibri"/>
+            <w:color w:val="000000" w:themeColor="text1"/>
+            <w:sz w:val="22"/>
+            <w:szCs w:val="22"/>
+            <w:lang w:val="en-US"/>
+          </w:rPr>
+          <w:t>Ubbiali</w:t>
+        </w:r>
+        <w:proofErr w:type="spellEnd"/>
+        <w:r>
+          <w:rPr>
+            <w:rStyle w:val="Collegamentoipertestuale"/>
+            <w:rFonts w:ascii="Calibri" w:hAnsi="Calibri" w:cs="Calibri"/>
+            <w:color w:val="000000" w:themeColor="text1"/>
+            <w:sz w:val="22"/>
+            <w:szCs w:val="22"/>
+            <w:lang w:val="en-US"/>
+          </w:rPr>
+          <w:t xml:space="preserve">. </w:t>
+        </w:r>
+      </w:hyperlink>
+    </w:p>
+    <w:p>
+      <w:pPr>
+        <w:pStyle w:val="Titolo1"/>
+        <w:rPr>
+          <w:rFonts w:ascii="Calibri" w:hAnsi="Calibri" w:cs="Calibri"/>
+          <w:sz w:val="26"/>
+          <w:szCs w:val="26"/>
+          <w:lang w:val="en-US"/>
+        </w:rPr>
+      </w:pPr>
+      <w:r>
+        <w:rPr>
+          <w:rFonts w:ascii="Calibri" w:hAnsi="Calibri" w:cs="Calibri"/>
+          <w:sz w:val="26"/>
+          <w:szCs w:val="26"/>
+          <w:lang w:val="en-US"/>
+        </w:rPr>
+        <w:t>Materials and Methods</w:t>
+      </w:r>
+    </w:p>
+    <w:p>
+      <w:pPr>
+        <w:spacing w:line="360" w:lineRule="auto"/>
+        <w:jc w:val="both"/>
+        <w:rPr>
+          <w:rFonts w:ascii="Calibri" w:hAnsi="Calibri" w:cs="Calibri"/>
+          <w:sz w:val="22"/>
+          <w:szCs w:val="22"/>
+          <w:lang w:val="en-US"/>
+        </w:rPr>
+      </w:pPr>
+      <w:proofErr w:type="spellStart"/>
+      <w:r>
+        <w:rPr>
+          <w:rFonts w:ascii="Calibri" w:hAnsi="Calibri" w:cs="Calibri"/>
+          <w:sz w:val="22"/>
+          <w:szCs w:val="22"/>
+          <w:lang w:val="en-US"/>
+        </w:rPr>
+        <w:t>ClimOO</w:t>
+      </w:r>
+      <w:proofErr w:type="spellEnd"/>
+      <w:r>
+        <w:rPr>
+          <w:rFonts w:ascii="Calibri" w:hAnsi="Calibri" w:cs="Calibri"/>
+          <w:sz w:val="22"/>
+          <w:szCs w:val="22"/>
+          <w:lang w:val="en-US"/>
+        </w:rPr>
+        <w:t xml:space="preserve"> ontology has been developed following the methodology proposed as a complement to FSSMF</w:t>
+      </w:r>
+      <w:r>
+        <w:rPr>
+          <w:rFonts w:ascii="Calibri" w:hAnsi="Calibri" w:cs="Calibri"/>
+          <w:sz w:val="22"/>
+          <w:szCs w:val="22"/>
+          <w:lang w:val="en-US"/>
+        </w:rPr>
+        <w:t xml:space="preserve"> </w:t>
+      </w:r>
+      <w:r>
+        <w:rPr>
+          <w:rFonts w:ascii="Calibri" w:hAnsi="Calibri" w:cs="Calibri"/>
+          <w:sz w:val="22"/>
+          <w:szCs w:val="22"/>
+          <w:lang w:val="en-US"/>
+        </w:rPr>
+        <w:fldChar w:fldCharType="begin"/>
+      </w:r>
+      <w:r>
+        <w:rPr>
+          <w:rFonts w:ascii="Calibri" w:hAnsi="Calibri" w:cs="Calibri"/>
+          <w:sz w:val="22"/>
+          <w:szCs w:val="22"/>
+          <w:lang w:val="en-US"/>
+        </w:rPr>
+        <w:instrText xml:space="preserve"> ADDIN ZOTERO_ITEM CSL_CITATION {"citationID":"ZzGrX5up","properties":{"formattedCitation":"(Ubbiali 2025)","plainCitation":"(Ubbiali 2025)","noteIndex":0},"citationItems":[{"id":4689,"uris":["http://zotero.org/users/8948421/items/IXDS7HXC"],"itemData":{"id":4689,"type":"thesis","genre":"PhD Thesis","publisher":"UNIMI","title":"Designing Foundational Strategies for Developing a Family of Food Systems Sustainability Ontologies","URL":"https://air.unimi.it/handle/2434/1161515","author":[{"family":"Ubbiali","given":"Giorgio A."}],"issued":{"date-parts":[["2025"]]}}}],"schema":"https://github.com/citation-style-language/schema/raw/master/csl-citation.json"} </w:instrText>
+      </w:r>
+      <w:r>
+        <w:rPr>
+          <w:rFonts w:ascii="Calibri" w:hAnsi="Calibri" w:cs="Calibri"/>
+          <w:sz w:val="22"/>
+          <w:szCs w:val="22"/>
+          <w:lang w:val="en-US"/>
+        </w:rPr>
+        <w:fldChar w:fldCharType="separate"/>
+      </w:r>
+      <w:r>
+        <w:rPr>
+          <w:rFonts w:ascii="Calibri" w:hAnsi="Calibri" w:cs="Calibri"/>
+          <w:noProof/>
+          <w:sz w:val="22"/>
+          <w:szCs w:val="22"/>
+          <w:lang w:val="en-US"/>
+        </w:rPr>
+        <w:t>(Ubbiali 2025)</w:t>
+      </w:r>
+      <w:r>
+        <w:rPr>
+          <w:rFonts w:ascii="Calibri" w:hAnsi="Calibri" w:cs="Calibri"/>
+          <w:sz w:val="22"/>
+          <w:szCs w:val="22"/>
+          <w:lang w:val="en-US"/>
+        </w:rPr>
+        <w:fldChar w:fldCharType="end"/>
+      </w:r>
+      <w:r>
+        <w:rPr>
+          <w:rFonts w:ascii="Calibri" w:hAnsi="Calibri" w:cs="Calibri"/>
+          <w:sz w:val="22"/>
+          <w:szCs w:val="22"/>
+          <w:lang w:val="en-US"/>
+        </w:rPr>
+        <w:t>.</w:t>
+      </w:r>
+      <w:r>
+        <w:rPr>
+          <w:rFonts w:ascii="Calibri" w:hAnsi="Calibri" w:cs="Calibri"/>
+          <w:sz w:val="22"/>
+          <w:szCs w:val="22"/>
+          <w:lang w:val="en-US"/>
+        </w:rPr>
+        <w:t xml:space="preserve"> See directly </w:t>
+      </w:r>
+      <w:r>
+        <w:rPr>
+          <w:rFonts w:ascii="Calibri" w:hAnsi="Calibri" w:cs="Calibri"/>
+          <w:sz w:val="22"/>
+          <w:szCs w:val="22"/>
+          <w:lang w:val="en-US"/>
+        </w:rPr>
+        <w:fldChar w:fldCharType="begin"/>
+      </w:r>
+      <w:r>
+        <w:rPr>
+          <w:rFonts w:ascii="Calibri" w:hAnsi="Calibri" w:cs="Calibri"/>
+          <w:sz w:val="22"/>
+          <w:szCs w:val="22"/>
+          <w:lang w:val="en-US"/>
+        </w:rPr>
+        <w:instrText xml:space="preserve"> ADDIN ZOTERO_ITEM CSL_CITATION {"citationID":"ZzGrX5up","properties":{"formattedCitation":"(Ubbiali 2025)","plainCitation":"(Ubbiali 2025)","noteIndex":0},"citationItems":[{"id":4689,"uris":["http://zotero.org/users/8948421/items/IXDS7HXC"],"itemData":{"id":4689,"type":"thesis","genre":"PhD Thesis","publisher":"UNIMI","title":"Designing Foundational Strategies for Developing a Family of Food Systems Sustainability Ontologies","URL":"https://air.unimi.it/handle/2434/1161515","author":[{"family":"Ubbiali","given":"Giorgio A."}],"issued":{"date-parts":[["2025"]]}}}],"schema":"https://github.com/citation-style-language/schema/raw/master/csl-citation.json"} </w:instrText>
+      </w:r>
+      <w:r>
+        <w:rPr>
+          <w:rFonts w:ascii="Calibri" w:hAnsi="Calibri" w:cs="Calibri"/>
+          <w:sz w:val="22"/>
+          <w:szCs w:val="22"/>
+          <w:lang w:val="en-US"/>
+        </w:rPr>
+        <w:fldChar w:fldCharType="separate"/>
+      </w:r>
+      <w:proofErr w:type="spellStart"/>
+      <w:r>
+        <w:rPr>
+          <w:rFonts w:ascii="Calibri" w:hAnsi="Calibri" w:cs="Calibri"/>
+          <w:sz w:val="22"/>
+          <w:szCs w:val="22"/>
+          <w:lang w:val="en-US"/>
+        </w:rPr>
+        <w:t>Ubbiali</w:t>
+      </w:r>
+      <w:proofErr w:type="spellEnd"/>
+      <w:r>
+        <w:rPr>
+          <w:rFonts w:ascii="Calibri" w:hAnsi="Calibri" w:cs="Calibri"/>
+          <w:sz w:val="22"/>
+          <w:szCs w:val="22"/>
+          <w:lang w:val="en-US"/>
+        </w:rPr>
+        <w:t xml:space="preserve"> </w:t>
+      </w:r>
+      <w:r>
+        <w:rPr>
+          <w:rFonts w:ascii="Calibri" w:hAnsi="Calibri" w:cs="Calibri"/>
+          <w:sz w:val="22"/>
+          <w:szCs w:val="22"/>
+          <w:lang w:val="en-US"/>
+        </w:rPr>
+        <w:t>(</w:t>
+      </w:r>
+      <w:r>
+        <w:rPr>
+          <w:rFonts w:ascii="Calibri" w:hAnsi="Calibri" w:cs="Calibri"/>
+          <w:sz w:val="22"/>
+          <w:szCs w:val="22"/>
+          <w:lang w:val="en-US"/>
+        </w:rPr>
+        <w:t>2025)</w:t>
+      </w:r>
+      <w:r>
+        <w:rPr>
+          <w:rFonts w:ascii="Calibri" w:hAnsi="Calibri" w:cs="Calibri"/>
+          <w:sz w:val="22"/>
+          <w:szCs w:val="22"/>
+          <w:lang w:val="en-US"/>
+        </w:rPr>
+        <w:fldChar w:fldCharType="end"/>
+      </w:r>
+      <w:r>
+        <w:rPr>
+          <w:rFonts w:ascii="Calibri" w:hAnsi="Calibri" w:cs="Calibri"/>
+          <w:sz w:val="22"/>
+          <w:szCs w:val="22"/>
+          <w:lang w:val="en-US"/>
+        </w:rPr>
+        <w:t xml:space="preserve"> for details</w:t>
+      </w:r>
+      <w:r>
+        <w:rPr>
+          <w:rFonts w:ascii="Calibri" w:hAnsi="Calibri" w:cs="Calibri"/>
+          <w:sz w:val="22"/>
+          <w:szCs w:val="22"/>
+          <w:lang w:val="en-US"/>
+        </w:rPr>
+        <w:t xml:space="preserve">. </w:t>
+      </w:r>
+      <w:hyperlink r:id="rId21" w:history="1">
+        <w:r>
+          <w:rPr>
+            <w:rStyle w:val="Collegamentoipertestuale"/>
+            <w:rFonts w:ascii="Calibri" w:hAnsi="Calibri" w:cs="Calibri"/>
+            <w:sz w:val="22"/>
+            <w:szCs w:val="22"/>
+            <w:lang w:val="en-US"/>
+          </w:rPr>
+          <w:t>Protégé</w:t>
+        </w:r>
+      </w:hyperlink>
+      <w:r>
+        <w:rPr>
+          <w:rFonts w:ascii="Calibri" w:hAnsi="Calibri" w:cs="Calibri"/>
+          <w:sz w:val="22"/>
+          <w:szCs w:val="22"/>
+          <w:lang w:val="en-US"/>
+        </w:rPr>
+        <w:t xml:space="preserve"> has been used as ontology editor to create </w:t>
+      </w:r>
+      <w:proofErr w:type="spellStart"/>
+      <w:r>
+        <w:rPr>
+          <w:rFonts w:ascii="Calibri" w:hAnsi="Calibri" w:cs="Calibri"/>
+          <w:sz w:val="22"/>
+          <w:szCs w:val="22"/>
+          <w:lang w:val="en-US"/>
+        </w:rPr>
+        <w:t>ClimOO</w:t>
+      </w:r>
+      <w:proofErr w:type="spellEnd"/>
+      <w:r>
+        <w:rPr>
+          <w:rFonts w:ascii="Calibri" w:hAnsi="Calibri" w:cs="Calibri"/>
+          <w:sz w:val="22"/>
+          <w:szCs w:val="22"/>
+          <w:lang w:val="en-US"/>
+        </w:rPr>
+        <w:t xml:space="preserve"> Ontology. </w:t>
+      </w:r>
+    </w:p>
+    <w:p>
+      <w:pPr>
+        <w:spacing w:line="360" w:lineRule="auto"/>
+        <w:jc w:val="both"/>
+        <w:rPr>
+          <w:rFonts w:ascii="Calibri" w:hAnsi="Calibri" w:cs="Calibri"/>
+          <w:sz w:val="22"/>
+          <w:szCs w:val="22"/>
+          <w:lang w:val="en-US"/>
+        </w:rPr>
+      </w:pPr>
+      <w:r>
+        <w:rPr>
+          <w:rFonts w:ascii="Calibri" w:hAnsi="Calibri" w:cs="Calibri"/>
+          <w:sz w:val="22"/>
+          <w:szCs w:val="22"/>
+          <w:lang w:val="en-US"/>
+        </w:rPr>
+        <w:t xml:space="preserve">FSSMF cover the </w:t>
+      </w:r>
+      <w:r>
+        <w:rPr>
+          <w:rFonts w:ascii="Calibri" w:hAnsi="Calibri" w:cs="Calibri"/>
+          <w:sz w:val="22"/>
+          <w:szCs w:val="22"/>
+          <w:lang w:val="en-US"/>
+        </w:rPr>
+        <w:t>following guidelines, each one detailed below:</w:t>
+      </w:r>
+    </w:p>
+    <w:p>
+      <w:pPr>
+        <w:numPr>
+          <w:ilvl w:val="0"/>
+          <w:numId w:val="5"/>
+        </w:numPr>
+        <w:spacing w:line="360" w:lineRule="auto"/>
+        <w:jc w:val="both"/>
+        <w:rPr>
+          <w:rFonts w:ascii="Calibri" w:hAnsi="Calibri" w:cs="Calibri"/>
+          <w:sz w:val="22"/>
+          <w:szCs w:val="22"/>
+        </w:rPr>
+      </w:pPr>
+      <w:r>
+        <w:rPr>
+          <w:rFonts w:ascii="Calibri" w:hAnsi="Calibri" w:cs="Calibri"/>
+          <w:sz w:val="22"/>
+          <w:szCs w:val="22"/>
+          <w:lang w:val="en-US"/>
+        </w:rPr>
+        <w:lastRenderedPageBreak/>
+        <w:t>Goal definition.</w:t>
+      </w:r>
+    </w:p>
+    <w:p>
+      <w:pPr>
+        <w:pStyle w:val="Paragrafoelenco"/>
+        <w:numPr>
+          <w:ilvl w:val="0"/>
+          <w:numId w:val="5"/>
+        </w:numPr>
+        <w:spacing w:line="360" w:lineRule="auto"/>
+        <w:rPr>
+          <w:rFonts w:ascii="Calibri" w:hAnsi="Calibri" w:cs="Calibri"/>
+          <w:sz w:val="22"/>
+          <w:szCs w:val="22"/>
+          <w:lang w:val="en-US"/>
+        </w:rPr>
+      </w:pPr>
+      <w:r>
+        <w:rPr>
+          <w:rFonts w:ascii="Calibri" w:hAnsi="Calibri" w:cs="Calibri"/>
+          <w:sz w:val="22"/>
+          <w:szCs w:val="22"/>
+          <w:lang w:val="en-US"/>
+        </w:rPr>
+        <w:t>Identification of available resources.</w:t>
+      </w:r>
+    </w:p>
+    <w:p>
+      <w:pPr>
+        <w:numPr>
+          <w:ilvl w:val="0"/>
+          <w:numId w:val="5"/>
+        </w:numPr>
+        <w:spacing w:line="360" w:lineRule="auto"/>
+        <w:jc w:val="both"/>
+        <w:rPr>
+          <w:rFonts w:ascii="Calibri" w:hAnsi="Calibri" w:cs="Calibri"/>
+          <w:sz w:val="22"/>
+          <w:szCs w:val="22"/>
+        </w:rPr>
+      </w:pPr>
+      <w:r>
+        <w:rPr>
+          <w:rFonts w:ascii="Calibri" w:hAnsi="Calibri" w:cs="Calibri"/>
+          <w:sz w:val="22"/>
+          <w:szCs w:val="22"/>
+          <w:lang w:val="en-US"/>
+        </w:rPr>
+        <w:t xml:space="preserve">Stakeholders’ identification. </w:t>
+      </w:r>
+      <w:bookmarkStart w:id="1" w:name="_Hlk170995250"/>
+    </w:p>
+    <w:p>
+      <w:pPr>
+        <w:numPr>
+          <w:ilvl w:val="0"/>
+          <w:numId w:val="5"/>
+        </w:numPr>
+        <w:spacing w:line="360" w:lineRule="auto"/>
+        <w:jc w:val="both"/>
+        <w:rPr>
+          <w:rFonts w:ascii="Calibri" w:hAnsi="Calibri" w:cs="Calibri"/>
+          <w:sz w:val="22"/>
+          <w:szCs w:val="22"/>
+        </w:rPr>
+      </w:pPr>
+      <w:r>
+        <w:rPr>
+          <w:rFonts w:ascii="Calibri" w:hAnsi="Calibri" w:cs="Calibri"/>
+          <w:sz w:val="22"/>
+          <w:szCs w:val="22"/>
+          <w:lang w:val="en-US"/>
+        </w:rPr>
+        <w:t>Stakeholders’ engagement.</w:t>
+      </w:r>
+    </w:p>
+    <w:p>
+      <w:pPr>
+        <w:numPr>
+          <w:ilvl w:val="0"/>
+          <w:numId w:val="5"/>
+        </w:numPr>
+        <w:spacing w:line="360" w:lineRule="auto"/>
+        <w:jc w:val="both"/>
+        <w:rPr>
+          <w:rFonts w:ascii="Calibri" w:hAnsi="Calibri" w:cs="Calibri"/>
+          <w:sz w:val="22"/>
+          <w:szCs w:val="22"/>
+        </w:rPr>
+      </w:pPr>
+      <w:r>
+        <w:rPr>
+          <w:rFonts w:ascii="Calibri" w:hAnsi="Calibri" w:cs="Calibri"/>
+          <w:sz w:val="22"/>
+          <w:szCs w:val="22"/>
+          <w:lang w:val="en-US"/>
+        </w:rPr>
+        <w:t>Project narrative formulation.</w:t>
+      </w:r>
+    </w:p>
+    <w:p>
+      <w:pPr>
+        <w:numPr>
+          <w:ilvl w:val="0"/>
+          <w:numId w:val="5"/>
+        </w:numPr>
+        <w:spacing w:line="360" w:lineRule="auto"/>
+        <w:jc w:val="both"/>
+        <w:rPr>
+          <w:rFonts w:ascii="Calibri" w:hAnsi="Calibri" w:cs="Calibri"/>
+          <w:sz w:val="22"/>
+          <w:szCs w:val="22"/>
+        </w:rPr>
+      </w:pPr>
+      <w:r>
+        <w:rPr>
+          <w:rFonts w:ascii="Calibri" w:hAnsi="Calibri" w:cs="Calibri"/>
+          <w:sz w:val="22"/>
+          <w:szCs w:val="22"/>
+          <w:lang w:val="en-US"/>
+        </w:rPr>
+        <w:t>Ontology construction.</w:t>
+      </w:r>
+    </w:p>
+    <w:p>
+      <w:pPr>
+        <w:numPr>
+          <w:ilvl w:val="0"/>
+          <w:numId w:val="5"/>
+        </w:numPr>
+        <w:spacing w:line="360" w:lineRule="auto"/>
+        <w:jc w:val="both"/>
+        <w:rPr>
+          <w:rFonts w:ascii="Calibri" w:hAnsi="Calibri" w:cs="Calibri"/>
+          <w:sz w:val="22"/>
+          <w:szCs w:val="22"/>
+        </w:rPr>
+      </w:pPr>
+      <w:r>
+        <w:rPr>
+          <w:rFonts w:ascii="Calibri" w:hAnsi="Calibri" w:cs="Calibri"/>
+          <w:sz w:val="22"/>
+          <w:szCs w:val="22"/>
+          <w:lang w:val="en-US"/>
+        </w:rPr>
+        <w:t>Ontology approval.</w:t>
+      </w:r>
+    </w:p>
+    <w:p>
+      <w:pPr>
+        <w:numPr>
+          <w:ilvl w:val="0"/>
+          <w:numId w:val="5"/>
+        </w:numPr>
+        <w:spacing w:line="360" w:lineRule="auto"/>
+        <w:jc w:val="both"/>
+        <w:rPr>
+          <w:rFonts w:ascii="Calibri" w:hAnsi="Calibri" w:cs="Calibri"/>
+          <w:sz w:val="22"/>
+          <w:szCs w:val="22"/>
+          <w:lang w:val="en-US"/>
+        </w:rPr>
+      </w:pPr>
+      <w:r>
+        <w:rPr>
+          <w:rFonts w:ascii="Calibri" w:hAnsi="Calibri" w:cs="Calibri"/>
+          <w:sz w:val="22"/>
+          <w:szCs w:val="22"/>
+          <w:lang w:val="en-US"/>
+        </w:rPr>
+        <w:t xml:space="preserve">Ontology curation, documentation, and implementation. </w:t>
+      </w:r>
+      <w:bookmarkEnd w:id="1"/>
+    </w:p>
+    <w:p>
+      <w:pPr>
+        <w:pStyle w:val="Titolo2"/>
+        <w:rPr>
+          <w:rFonts w:ascii="Calibri" w:hAnsi="Calibri" w:cs="Calibri"/>
+          <w:sz w:val="24"/>
+          <w:szCs w:val="24"/>
+          <w:lang w:val="en-US"/>
+        </w:rPr>
+      </w:pPr>
+      <w:r>
+        <w:rPr>
+          <w:rFonts w:ascii="Calibri" w:hAnsi="Calibri" w:cs="Calibri"/>
+          <w:sz w:val="24"/>
+          <w:szCs w:val="24"/>
+          <w:lang w:val="en-US"/>
+        </w:rPr>
+        <w:t>Goal definition</w:t>
+      </w:r>
+    </w:p>
+    <w:p>
+      <w:pPr>
+        <w:pStyle w:val="Titolo2"/>
+        <w:rPr>
+          <w:rFonts w:ascii="Calibri" w:hAnsi="Calibri" w:cs="Calibri"/>
+          <w:sz w:val="24"/>
+          <w:szCs w:val="24"/>
+          <w:lang w:val="en-US"/>
+        </w:rPr>
+      </w:pPr>
+      <w:r>
+        <w:rPr>
+          <w:rFonts w:ascii="Calibri" w:hAnsi="Calibri" w:cs="Calibri"/>
+          <w:sz w:val="24"/>
+          <w:szCs w:val="24"/>
+          <w:lang w:val="en-US"/>
+        </w:rPr>
+        <w:t>Identification of available resources</w:t>
+      </w:r>
+    </w:p>
+    <w:p>
+      <w:pPr>
+        <w:pStyle w:val="Titolo2"/>
+        <w:rPr>
+          <w:rFonts w:ascii="Calibri" w:hAnsi="Calibri" w:cs="Calibri"/>
+          <w:sz w:val="24"/>
+          <w:szCs w:val="24"/>
+          <w:lang w:val="en-US"/>
+        </w:rPr>
+      </w:pPr>
+      <w:r>
+        <w:rPr>
+          <w:rFonts w:ascii="Calibri" w:hAnsi="Calibri" w:cs="Calibri"/>
+          <w:sz w:val="24"/>
+          <w:szCs w:val="24"/>
+          <w:lang w:val="en-US"/>
+        </w:rPr>
+        <w:t>Stakeholders’ identificatio</w:t>
+      </w:r>
+      <w:r>
+        <w:rPr>
+          <w:rFonts w:ascii="Calibri" w:hAnsi="Calibri" w:cs="Calibri"/>
+          <w:sz w:val="24"/>
+          <w:szCs w:val="24"/>
+          <w:lang w:val="en-US"/>
+        </w:rPr>
+        <w:t>n</w:t>
+      </w:r>
+      <w:r>
+        <w:rPr>
+          <w:rFonts w:ascii="Calibri" w:hAnsi="Calibri" w:cs="Calibri"/>
+          <w:sz w:val="24"/>
+          <w:szCs w:val="24"/>
+          <w:lang w:val="en-US"/>
+        </w:rPr>
+        <w:t xml:space="preserve"> </w:t>
+      </w:r>
+    </w:p>
+    <w:p>
+      <w:pPr>
+        <w:pStyle w:val="Titolo2"/>
+        <w:rPr>
+          <w:rFonts w:ascii="Calibri" w:hAnsi="Calibri" w:cs="Calibri"/>
+          <w:sz w:val="24"/>
+          <w:szCs w:val="24"/>
+          <w:lang w:val="en-US"/>
+        </w:rPr>
+      </w:pPr>
+      <w:r>
+        <w:rPr>
+          <w:rFonts w:ascii="Calibri" w:hAnsi="Calibri" w:cs="Calibri"/>
+          <w:sz w:val="24"/>
+          <w:szCs w:val="24"/>
+          <w:lang w:val="en-US"/>
+        </w:rPr>
+        <w:t>Stakeholders’ engagement</w:t>
+      </w:r>
+    </w:p>
+    <w:p>
+      <w:pPr>
+        <w:pStyle w:val="Titolo2"/>
+        <w:rPr>
+          <w:rFonts w:ascii="Calibri" w:hAnsi="Calibri" w:cs="Calibri"/>
+          <w:sz w:val="24"/>
+          <w:szCs w:val="24"/>
+        </w:rPr>
+      </w:pPr>
+      <w:r>
+        <w:rPr>
+          <w:rFonts w:ascii="Calibri" w:hAnsi="Calibri" w:cs="Calibri"/>
+          <w:sz w:val="24"/>
+          <w:szCs w:val="24"/>
+          <w:lang w:val="en-US"/>
+        </w:rPr>
+        <w:t>Project narrative formulation</w:t>
+      </w:r>
+    </w:p>
+    <w:p>
+      <w:pPr>
+        <w:pStyle w:val="Titolo2"/>
+        <w:rPr>
+          <w:rFonts w:ascii="Calibri" w:hAnsi="Calibri" w:cs="Calibri"/>
+          <w:sz w:val="24"/>
+          <w:szCs w:val="24"/>
+        </w:rPr>
+      </w:pPr>
+      <w:r>
+        <w:rPr>
+          <w:rFonts w:ascii="Calibri" w:hAnsi="Calibri" w:cs="Calibri"/>
+          <w:sz w:val="24"/>
+          <w:szCs w:val="24"/>
+          <w:lang w:val="en-US"/>
+        </w:rPr>
+        <w:t>Ontology construction</w:t>
+      </w:r>
+    </w:p>
+    <w:p>
+      <w:pPr>
+        <w:pStyle w:val="Titolo2"/>
+        <w:rPr>
+          <w:rFonts w:ascii="Calibri" w:hAnsi="Calibri" w:cs="Calibri"/>
+          <w:sz w:val="24"/>
+          <w:szCs w:val="24"/>
+        </w:rPr>
+      </w:pPr>
+      <w:r>
+        <w:rPr>
+          <w:rFonts w:ascii="Calibri" w:hAnsi="Calibri" w:cs="Calibri"/>
+          <w:sz w:val="24"/>
+          <w:szCs w:val="24"/>
+          <w:lang w:val="en-US"/>
+        </w:rPr>
+        <w:t>Ontology approval</w:t>
+      </w:r>
+    </w:p>
+    <w:p>
+      <w:pPr>
+        <w:pStyle w:val="Titolo2"/>
+        <w:rPr>
+          <w:rFonts w:ascii="Calibri" w:hAnsi="Calibri" w:cs="Calibri"/>
+          <w:sz w:val="24"/>
+          <w:szCs w:val="24"/>
+          <w:lang w:val="en-US"/>
+        </w:rPr>
+      </w:pPr>
+      <w:r>
+        <w:rPr>
+          <w:rFonts w:ascii="Calibri" w:hAnsi="Calibri" w:cs="Calibri"/>
+          <w:sz w:val="24"/>
+          <w:szCs w:val="24"/>
+          <w:lang w:val="en-US"/>
+        </w:rPr>
+        <w:t>Ontology curation, documentation, and implementation</w:t>
+      </w:r>
+    </w:p>
+    <w:p>
+      <w:pPr>
+        <w:spacing w:line="360" w:lineRule="auto"/>
+        <w:jc w:val="both"/>
+        <w:rPr>
+          <w:rFonts w:ascii="Calibri" w:hAnsi="Calibri" w:cs="Calibri"/>
+          <w:sz w:val="22"/>
+          <w:szCs w:val="22"/>
+          <w:lang w:val="en-US"/>
+        </w:rPr>
+      </w:pPr>
+      <w:r>
+        <w:rPr>
+          <w:rFonts w:ascii="Calibri" w:hAnsi="Calibri" w:cs="Calibri"/>
+          <w:sz w:val="22"/>
+          <w:szCs w:val="22"/>
+          <w:lang w:val="en-US"/>
+        </w:rPr>
+        <w:t>TBD</w:t>
+      </w:r>
+    </w:p>
+    <w:p>
+      <w:pPr>
+        <w:pStyle w:val="Titolo1"/>
+        <w:rPr>
+          <w:rFonts w:ascii="Calibri" w:hAnsi="Calibri" w:cs="Calibri"/>
+          <w:sz w:val="26"/>
+          <w:szCs w:val="26"/>
+          <w:lang w:val="en-US"/>
+        </w:rPr>
+      </w:pPr>
+      <w:r>
+        <w:rPr>
+          <w:rFonts w:ascii="Calibri" w:hAnsi="Calibri" w:cs="Calibri"/>
+          <w:sz w:val="26"/>
+          <w:szCs w:val="26"/>
+          <w:lang w:val="en-US"/>
+        </w:rPr>
+        <w:t xml:space="preserve">Get in Touch </w:t>
+      </w:r>
+    </w:p>
+    <w:p>
+      <w:pPr>
+        <w:spacing w:line="360" w:lineRule="auto"/>
+        <w:jc w:val="both"/>
+        <w:rPr>
+          <w:rFonts w:ascii="Calibri" w:hAnsi="Calibri" w:cs="Calibri"/>
+          <w:lang w:val="en-US"/>
+        </w:rPr>
+      </w:pPr>
+      <w:r>
+        <w:rPr>
+          <w:rFonts w:ascii="Calibri" w:hAnsi="Calibri" w:cs="Calibri"/>
+          <w:lang w:val="en-US"/>
+        </w:rPr>
+        <w:t xml:space="preserve">Please contact </w:t>
+      </w:r>
+      <w:hyperlink r:id="rId22" w:history="1">
+        <w:r>
+          <w:rPr>
+            <w:rStyle w:val="Collegamentoipertestuale"/>
+            <w:rFonts w:ascii="Calibri" w:hAnsi="Calibri" w:cs="Calibri"/>
+            <w:color w:val="auto"/>
+            <w:lang w:val="en-US"/>
+          </w:rPr>
+          <w:t xml:space="preserve">Giorgio A. </w:t>
+        </w:r>
+        <w:proofErr w:type="spellStart"/>
+        <w:r>
+          <w:rPr>
+            <w:rStyle w:val="Collegamentoipertestuale"/>
+            <w:rFonts w:ascii="Calibri" w:hAnsi="Calibri" w:cs="Calibri"/>
+            <w:color w:val="auto"/>
+            <w:lang w:val="en-US"/>
+          </w:rPr>
+          <w:t>Ubbiali</w:t>
+        </w:r>
+        <w:proofErr w:type="spellEnd"/>
+      </w:hyperlink>
+      <w:r>
+        <w:rPr>
+          <w:rFonts w:ascii="Calibri" w:hAnsi="Calibri" w:cs="Calibri"/>
+          <w:lang w:val="en-US"/>
+        </w:rPr>
+        <w:t xml:space="preserve"> in case you wish to get involved and participate in the development of </w:t>
+      </w:r>
+      <w:r>
+        <w:rPr>
+          <w:rFonts w:ascii="Calibri" w:hAnsi="Calibri" w:cs="Calibri"/>
+          <w:lang w:val="en-US"/>
+        </w:rPr>
+        <w:t xml:space="preserve">the </w:t>
+      </w:r>
+      <w:proofErr w:type="spellStart"/>
+      <w:r>
+        <w:rPr>
+          <w:rFonts w:ascii="Calibri" w:hAnsi="Calibri" w:cs="Calibri"/>
+          <w:lang w:val="en-US"/>
+        </w:rPr>
+        <w:t>ClimOO</w:t>
+      </w:r>
+      <w:proofErr w:type="spellEnd"/>
+      <w:r>
+        <w:rPr>
+          <w:rFonts w:ascii="Calibri" w:hAnsi="Calibri" w:cs="Calibri"/>
+          <w:lang w:val="en-US"/>
+        </w:rPr>
+        <w:t xml:space="preserve"> Ontology</w:t>
+      </w:r>
+      <w:r>
+        <w:rPr>
+          <w:rFonts w:ascii="Calibri" w:hAnsi="Calibri" w:cs="Calibri"/>
+          <w:lang w:val="en-US"/>
+        </w:rPr>
+        <w:t>.</w:t>
+      </w:r>
+    </w:p>
+    <w:p>
+      <w:pPr>
+        <w:pStyle w:val="Titolo1"/>
+        <w:rPr>
+          <w:rFonts w:ascii="Calibri" w:hAnsi="Calibri" w:cs="Calibri"/>
+          <w:sz w:val="26"/>
+          <w:szCs w:val="26"/>
+          <w:lang w:val="en-US"/>
+        </w:rPr>
+      </w:pPr>
+      <w:r>
+        <w:rPr>
+          <w:rFonts w:ascii="Calibri" w:hAnsi="Calibri" w:cs="Calibri"/>
+          <w:sz w:val="26"/>
+          <w:szCs w:val="26"/>
+          <w:lang w:val="en-US"/>
+        </w:rPr>
+        <w:t xml:space="preserve">Bibliography </w:t>
+      </w:r>
+    </w:p>
+    <w:p>
+      <w:pPr>
+        <w:pStyle w:val="Bibliografia"/>
+        <w:rPr>
+          <w:rFonts w:ascii="Calibri" w:hAnsi="Calibri" w:cs="Calibri"/>
+          <w:sz w:val="22"/>
+        </w:rPr>
+      </w:pPr>
+      <w:r>
+        <w:rPr>
+          <w:rFonts w:ascii="Calibri" w:hAnsi="Calibri" w:cs="Calibri"/>
+          <w:sz w:val="22"/>
+          <w:szCs w:val="22"/>
+          <w:u w:val="single"/>
+          <w:lang w:val="en-US"/>
+        </w:rPr>
+        <w:fldChar w:fldCharType="begin"/>
+      </w:r>
+      <w:r>
+        <w:rPr>
+          <w:rFonts w:ascii="Calibri" w:hAnsi="Calibri" w:cs="Calibri"/>
+          <w:sz w:val="22"/>
+          <w:szCs w:val="22"/>
+          <w:u w:val="single"/>
+          <w:lang w:val="en-US"/>
+        </w:rPr>
+        <w:instrText xml:space="preserve"> ADDIN ZOTERO_BIBL {"uncited":[],"omitted":[],"custom":[]} CSL_BIBLIOGRAPHY </w:instrText>
+      </w:r>
+      <w:r>
+        <w:rPr>
+          <w:rFonts w:ascii="Calibri" w:hAnsi="Calibri" w:cs="Calibri"/>
+          <w:sz w:val="22"/>
+          <w:szCs w:val="22"/>
+          <w:u w:val="single"/>
+          <w:lang w:val="en-US"/>
+        </w:rPr>
+        <w:fldChar w:fldCharType="separate"/>
+      </w:r>
+      <w:proofErr w:type="spellStart"/>
+      <w:r>
+        <w:rPr>
+          <w:rFonts w:ascii="Calibri" w:hAnsi="Calibri" w:cs="Calibri"/>
+          <w:sz w:val="22"/>
+          <w:lang w:val="en-US"/>
+        </w:rPr>
+        <w:t>Ubbiali</w:t>
+      </w:r>
+      <w:proofErr w:type="spellEnd"/>
+      <w:r>
+        <w:rPr>
+          <w:rFonts w:ascii="Calibri" w:hAnsi="Calibri" w:cs="Calibri"/>
+          <w:sz w:val="22"/>
+          <w:lang w:val="en-US"/>
+        </w:rPr>
+        <w:t xml:space="preserve">, Giorgio A. 2025. «Designing Foundational Strategies for Developing a Family of Food Systems Sustainability Ontologies». </w:t>
+      </w:r>
+      <w:r>
+        <w:rPr>
+          <w:rFonts w:ascii="Calibri" w:hAnsi="Calibri" w:cs="Calibri"/>
+          <w:sz w:val="22"/>
+        </w:rPr>
+        <w:t>PhD Thesis, UNIMI.</w:t>
+      </w:r>
+    </w:p>
+    <w:p>
+      <w:pPr>
+        <w:pStyle w:val="Bibliografia"/>
+        <w:spacing w:line="360" w:lineRule="auto"/>
+        <w:jc w:val="both"/>
+        <w:rPr>
+          <w:rFonts w:ascii="Calibri" w:hAnsi="Calibri" w:cs="Calibri"/>
+          <w:sz w:val="32"/>
+          <w:szCs w:val="32"/>
+          <w:u w:val="single"/>
+          <w:lang w:val="en-US"/>
+        </w:rPr>
+      </w:pPr>
+      <w:r>
+        <w:rPr>
+          <w:rFonts w:ascii="Calibri" w:hAnsi="Calibri" w:cs="Calibri"/>
+          <w:sz w:val="22"/>
+          <w:szCs w:val="22"/>
+          <w:u w:val="single"/>
+          <w:lang w:val="en-US"/>
+        </w:rPr>
+        <w:fldChar w:fldCharType="end"/>
       </w:r>
     </w:p>
     <w:sectPr>
@@ -28,6 +2217,621 @@
     </w:sectPr>
   </w:body>
 </w:document>
+</file>
+
+<file path=word/comments.xml><?xml version="1.0" encoding="utf-8"?>
+<w:comments xmlns:wpc="http://schemas.microsoft.com/office/word/2010/wordprocessingCanvas" xmlns:cx="http://schemas.microsoft.com/office/drawing/2014/chartex" xmlns:cx1="http://schemas.microsoft.com/office/drawing/2015/9/8/chartex" xmlns:cx2="http://schemas.microsoft.com/office/drawing/2015/10/21/chartex" xmlns:cx3="http://schemas.microsoft.com/office/drawing/2016/5/9/chartex" xmlns:cx4="http://schemas.microsoft.com/office/drawing/2016/5/10/chartex" xmlns:cx5="http://schemas.microsoft.com/office/drawing/2016/5/11/chartex" xmlns:cx6="http://schemas.microsoft.com/office/drawing/2016/5/12/chartex" xmlns:cx7="http://schemas.microsoft.com/office/drawing/2016/5/13/chartex" xmlns:cx8="http://schemas.microsoft.com/office/drawing/2016/5/14/chartex" xmlns:mc="http://schemas.openxmlformats.org/markup-compatibility/2006" xmlns:aink="http://schemas.microsoft.com/office/drawing/2016/ink" xmlns:am3d="http://schemas.microsoft.com/office/drawing/2017/model3d" xmlns:o="urn:schemas-microsoft-com:office:office" xmlns:oel="http://schemas.microsoft.com/office/2019/extlst" xmlns:r="http://schemas.openxmlformats.org/officeDocument/2006/relationships" xmlns:m="http://schemas.openxmlformats.org/officeDocument/2006/math" xmlns:v="urn:schemas-microsoft-com:vml" xmlns:wp14="http://schemas.microsoft.com/office/word/2010/wordprocessingDrawing" xmlns:wp="http://schemas.openxmlformats.org/drawingml/2006/wordprocessingDrawing" xmlns:w10="urn:schemas-microsoft-com:office:word" xmlns:w="http://schemas.openxmlformats.org/wordprocessingml/2006/main" xmlns:w14="http://schemas.microsoft.com/office/word/2010/wordml" xmlns:w15="http://schemas.microsoft.com/office/word/2012/wordml" xmlns:w16cex="http://schemas.microsoft.com/office/word/2018/wordml/cex" xmlns:w16cid="http://schemas.microsoft.com/office/word/2016/wordml/cid" xmlns:w16="http://schemas.microsoft.com/office/word/2018/wordml" xmlns:w16du="http://schemas.microsoft.com/office/word/2023/wordml/word16du" xmlns:w16sdtdh="http://schemas.microsoft.com/office/word/2020/wordml/sdtdatahash" xmlns:w16se="http://schemas.microsoft.com/office/word/2015/wordml/symex" xmlns:wpg="http://schemas.microsoft.com/office/word/2010/wordprocessingGroup" xmlns:wpi="http://schemas.microsoft.com/office/word/2010/wordprocessingInk" xmlns:wne="http://schemas.microsoft.com/office/word/2006/wordml" xmlns:wps="http://schemas.microsoft.com/office/word/2010/wordprocessingShape" mc:Ignorable="w14 w15 w16se w16cid w16 w16cex w16sdtdh w16du wp14">
+  <w:comment w:id="0" w:author="Giorgio Alberto Ubbiali" w:date="2025-07-10T12:10:00Z" w:initials="MOU">
+    <w:p>
+      <w:r>
+        <w:rPr>
+          <w:rStyle w:val="Rimandocommento"/>
+        </w:rPr>
+        <w:annotationRef/>
+      </w:r>
+      <w:r>
+        <w:rPr>
+          <w:sz w:val="20"/>
+          <w:szCs w:val="20"/>
+        </w:rPr>
+        <w:t>to add the link to the file.</w:t>
+      </w:r>
+    </w:p>
+  </w:comment>
+</w:comments>
+</file>
+
+<file path=word/commentsExtended.xml><?xml version="1.0" encoding="utf-8"?>
+<w15:commentsEx xmlns:wpc="http://schemas.microsoft.com/office/word/2010/wordprocessingCanvas" xmlns:cx="http://schemas.microsoft.com/office/drawing/2014/chartex" xmlns:cx1="http://schemas.microsoft.com/office/drawing/2015/9/8/chartex" xmlns:cx2="http://schemas.microsoft.com/office/drawing/2015/10/21/chartex" xmlns:cx3="http://schemas.microsoft.com/office/drawing/2016/5/9/chartex" xmlns:cx4="http://schemas.microsoft.com/office/drawing/2016/5/10/chartex" xmlns:cx5="http://schemas.microsoft.com/office/drawing/2016/5/11/chartex" xmlns:cx6="http://schemas.microsoft.com/office/drawing/2016/5/12/chartex" xmlns:cx7="http://schemas.microsoft.com/office/drawing/2016/5/13/chartex" xmlns:cx8="http://schemas.microsoft.com/office/drawing/2016/5/14/chartex" xmlns:mc="http://schemas.openxmlformats.org/markup-compatibility/2006" xmlns:aink="http://schemas.microsoft.com/office/drawing/2016/ink" xmlns:am3d="http://schemas.microsoft.com/office/drawing/2017/model3d" xmlns:o="urn:schemas-microsoft-com:office:office" xmlns:oel="http://schemas.microsoft.com/office/2019/extlst" xmlns:r="http://schemas.openxmlformats.org/officeDocument/2006/relationships" xmlns:m="http://schemas.openxmlformats.org/officeDocument/2006/math" xmlns:v="urn:schemas-microsoft-com:vml" xmlns:wp14="http://schemas.microsoft.com/office/word/2010/wordprocessingDrawing" xmlns:wp="http://schemas.openxmlformats.org/drawingml/2006/wordprocessingDrawing" xmlns:w10="urn:schemas-microsoft-com:office:word" xmlns:w="http://schemas.openxmlformats.org/wordprocessingml/2006/main" xmlns:w14="http://schemas.microsoft.com/office/word/2010/wordml" xmlns:w15="http://schemas.microsoft.com/office/word/2012/wordml" xmlns:w16cex="http://schemas.microsoft.com/office/word/2018/wordml/cex" xmlns:w16cid="http://schemas.microsoft.com/office/word/2016/wordml/cid" xmlns:w16="http://schemas.microsoft.com/office/word/2018/wordml" xmlns:w16du="http://schemas.microsoft.com/office/word/2023/wordml/word16du" xmlns:w16sdtdh="http://schemas.microsoft.com/office/word/2020/wordml/sdtdatahash" xmlns:w16se="http://schemas.microsoft.com/office/word/2015/wordml/symex" xmlns:wpg="http://schemas.microsoft.com/office/word/2010/wordprocessingGroup" xmlns:wpi="http://schemas.microsoft.com/office/word/2010/wordprocessingInk" xmlns:wne="http://schemas.microsoft.com/office/word/2006/wordml" xmlns:wps="http://schemas.microsoft.com/office/word/2010/wordprocessingShape" mc:Ignorable="w14 w15 w16se w16cid w16 w16cex w16sdtdh w16du wp14">
+  <w15:commentEx w15:paraId="1F6F2761" w15:done="0"/>
+</w15:commentsEx>
+</file>
+
+<file path=word/commentsExtensible.xml><?xml version="1.0" encoding="utf-8"?>
+<w16cex:commentsExtensible xmlns:wpc="http://schemas.microsoft.com/office/word/2010/wordprocessingCanvas" xmlns:cx="http://schemas.microsoft.com/office/drawing/2014/chartex" xmlns:cx1="http://schemas.microsoft.com/office/drawing/2015/9/8/chartex" xmlns:cx2="http://schemas.microsoft.com/office/drawing/2015/10/21/chartex" xmlns:cx3="http://schemas.microsoft.com/office/drawing/2016/5/9/chartex" xmlns:cx4="http://schemas.microsoft.com/office/drawing/2016/5/10/chartex" xmlns:cx5="http://schemas.microsoft.com/office/drawing/2016/5/11/chartex" xmlns:cx6="http://schemas.microsoft.com/office/drawing/2016/5/12/chartex" xmlns:cx7="http://schemas.microsoft.com/office/drawing/2016/5/13/chartex" xmlns:cx8="http://schemas.microsoft.com/office/drawing/2016/5/14/chartex" xmlns:cr="http://schemas.microsoft.com/office/comments/2020/reactions" xmlns:mc="http://schemas.openxmlformats.org/markup-compatibility/2006" xmlns:aink="http://schemas.microsoft.com/office/drawing/2016/ink" xmlns:am3d="http://schemas.microsoft.com/office/drawing/2017/model3d" xmlns:o="urn:schemas-microsoft-com:office:office" xmlns:oel="http://schemas.microsoft.com/office/2019/extlst" xmlns:r="http://schemas.openxmlformats.org/officeDocument/2006/relationships" xmlns:m="http://schemas.openxmlformats.org/officeDocument/2006/math" xmlns:v="urn:schemas-microsoft-com:vml" xmlns:wp14="http://schemas.microsoft.com/office/word/2010/wordprocessingDrawing" xmlns:wp="http://schemas.openxmlformats.org/drawingml/2006/wordprocessingDrawing" xmlns:w10="urn:schemas-microsoft-com:office:word" xmlns:w="http://schemas.openxmlformats.org/wordprocessingml/2006/main" xmlns:w14="http://schemas.microsoft.com/office/word/2010/wordml" xmlns:w15="http://schemas.microsoft.com/office/word/2012/wordml" xmlns:w16cex="http://schemas.microsoft.com/office/word/2018/wordml/cex" xmlns:w16cid="http://schemas.microsoft.com/office/word/2016/wordml/cid" xmlns:w16="http://schemas.microsoft.com/office/word/2018/wordml" xmlns:w16du="http://schemas.microsoft.com/office/word/2023/wordml/word16du" xmlns:w16sdtdh="http://schemas.microsoft.com/office/word/2020/wordml/sdtdatahash" xmlns:w16se="http://schemas.microsoft.com/office/word/2015/wordml/symex" xmlns:wpg="http://schemas.microsoft.com/office/word/2010/wordprocessingGroup" xmlns:wpi="http://schemas.microsoft.com/office/word/2010/wordprocessingInk" xmlns:wne="http://schemas.microsoft.com/office/word/2006/wordml" xmlns:wps="http://schemas.microsoft.com/office/word/2010/wordprocessingShape" mc:Ignorable="w14 w15 w16se w16cid w16 w16cex w16sdtdh cr w16du wp14">
+  <w16cex:commentExtensible w16cex:durableId="0F9DB1CB" w16cex:dateUtc="2025-07-10T10:10:00Z"/>
+</w16cex:commentsExtensible>
+</file>
+
+<file path=word/commentsIds.xml><?xml version="1.0" encoding="utf-8"?>
+<w16cid:commentsIds xmlns:wpc="http://schemas.microsoft.com/office/word/2010/wordprocessingCanvas" xmlns:cx="http://schemas.microsoft.com/office/drawing/2014/chartex" xmlns:cx1="http://schemas.microsoft.com/office/drawing/2015/9/8/chartex" xmlns:cx2="http://schemas.microsoft.com/office/drawing/2015/10/21/chartex" xmlns:cx3="http://schemas.microsoft.com/office/drawing/2016/5/9/chartex" xmlns:cx4="http://schemas.microsoft.com/office/drawing/2016/5/10/chartex" xmlns:cx5="http://schemas.microsoft.com/office/drawing/2016/5/11/chartex" xmlns:cx6="http://schemas.microsoft.com/office/drawing/2016/5/12/chartex" xmlns:cx7="http://schemas.microsoft.com/office/drawing/2016/5/13/chartex" xmlns:cx8="http://schemas.microsoft.com/office/drawing/2016/5/14/chartex" xmlns:mc="http://schemas.openxmlformats.org/markup-compatibility/2006" xmlns:aink="http://schemas.microsoft.com/office/drawing/2016/ink" xmlns:am3d="http://schemas.microsoft.com/office/drawing/2017/model3d" xmlns:o="urn:schemas-microsoft-com:office:office" xmlns:oel="http://schemas.microsoft.com/office/2019/extlst" xmlns:r="http://schemas.openxmlformats.org/officeDocument/2006/relationships" xmlns:m="http://schemas.openxmlformats.org/officeDocument/2006/math" xmlns:v="urn:schemas-microsoft-com:vml" xmlns:wp14="http://schemas.microsoft.com/office/word/2010/wordprocessingDrawing" xmlns:wp="http://schemas.openxmlformats.org/drawingml/2006/wordprocessingDrawing" xmlns:w10="urn:schemas-microsoft-com:office:word" xmlns:w="http://schemas.openxmlformats.org/wordprocessingml/2006/main" xmlns:w14="http://schemas.microsoft.com/office/word/2010/wordml" xmlns:w15="http://schemas.microsoft.com/office/word/2012/wordml" xmlns:w16cex="http://schemas.microsoft.com/office/word/2018/wordml/cex" xmlns:w16cid="http://schemas.microsoft.com/office/word/2016/wordml/cid" xmlns:w16="http://schemas.microsoft.com/office/word/2018/wordml" xmlns:w16du="http://schemas.microsoft.com/office/word/2023/wordml/word16du" xmlns:w16sdtdh="http://schemas.microsoft.com/office/word/2020/wordml/sdtdatahash" xmlns:w16se="http://schemas.microsoft.com/office/word/2015/wordml/symex" xmlns:wpg="http://schemas.microsoft.com/office/word/2010/wordprocessingGroup" xmlns:wpi="http://schemas.microsoft.com/office/word/2010/wordprocessingInk" xmlns:wne="http://schemas.microsoft.com/office/word/2006/wordml" xmlns:wps="http://schemas.microsoft.com/office/word/2010/wordprocessingShape" mc:Ignorable="w14 w15 w16se w16cid w16 w16cex w16sdtdh w16du wp14">
+  <w16cid:commentId w16cid:paraId="1F6F2761" w16cid:durableId="0F9DB1CB"/>
+</w16cid:commentsIds>
+</file>
+
+<file path=word/numbering.xml><?xml version="1.0" encoding="utf-8"?>
+<w:numbering xmlns:wpc="http://schemas.microsoft.com/office/word/2010/wordprocessingCanvas" xmlns:cx="http://schemas.microsoft.com/office/drawing/2014/chartex" xmlns:cx1="http://schemas.microsoft.com/office/drawing/2015/9/8/chartex" xmlns:cx2="http://schemas.microsoft.com/office/drawing/2015/10/21/chartex" xmlns:cx3="http://schemas.microsoft.com/office/drawing/2016/5/9/chartex" xmlns:cx4="http://schemas.microsoft.com/office/drawing/2016/5/10/chartex" xmlns:cx5="http://schemas.microsoft.com/office/drawing/2016/5/11/chartex" xmlns:cx6="http://schemas.microsoft.com/office/drawing/2016/5/12/chartex" xmlns:cx7="http://schemas.microsoft.com/office/drawing/2016/5/13/chartex" xmlns:cx8="http://schemas.microsoft.com/office/drawing/2016/5/14/chartex" xmlns:mc="http://schemas.openxmlformats.org/markup-compatibility/2006" xmlns:aink="http://schemas.microsoft.com/office/drawing/2016/ink" xmlns:am3d="http://schemas.microsoft.com/office/drawing/2017/model3d" xmlns:o="urn:schemas-microsoft-com:office:office" xmlns:oel="http://schemas.microsoft.com/office/2019/extlst" xmlns:r="http://schemas.openxmlformats.org/officeDocument/2006/relationships" xmlns:m="http://schemas.openxmlformats.org/officeDocument/2006/math" xmlns:v="urn:schemas-microsoft-com:vml" xmlns:wp14="http://schemas.microsoft.com/office/word/2010/wordprocessingDrawing" xmlns:wp="http://schemas.openxmlformats.org/drawingml/2006/wordprocessingDrawing" xmlns:w10="urn:schemas-microsoft-com:office:word" xmlns:w="http://schemas.openxmlformats.org/wordprocessingml/2006/main" xmlns:w14="http://schemas.microsoft.com/office/word/2010/wordml" xmlns:w15="http://schemas.microsoft.com/office/word/2012/wordml" xmlns:w16cex="http://schemas.microsoft.com/office/word/2018/wordml/cex" xmlns:w16cid="http://schemas.microsoft.com/office/word/2016/wordml/cid" xmlns:w16="http://schemas.microsoft.com/office/word/2018/wordml" xmlns:w16du="http://schemas.microsoft.com/office/word/2023/wordml/word16du" xmlns:w16sdtdh="http://schemas.microsoft.com/office/word/2020/wordml/sdtdatahash" xmlns:w16se="http://schemas.microsoft.com/office/word/2015/wordml/symex" xmlns:wpg="http://schemas.microsoft.com/office/word/2010/wordprocessingGroup" xmlns:wpi="http://schemas.microsoft.com/office/word/2010/wordprocessingInk" xmlns:wne="http://schemas.microsoft.com/office/word/2006/wordml" xmlns:wps="http://schemas.microsoft.com/office/word/2010/wordprocessingShape" mc:Ignorable="w14 w15 w16se w16cid w16 w16cex w16sdtdh w16du wp14">
+  <w:abstractNum w:abstractNumId="0" w15:restartNumberingAfterBreak="0">
+    <w:nsid w:val="489125BA"/>
+    <w:multiLevelType w:val="hybridMultilevel"/>
+    <w:tmpl w:val="207443AA"/>
+    <w:lvl w:ilvl="0" w:tplc="0410000F">
+      <w:start w:val="1"/>
+      <w:numFmt w:val="decimal"/>
+      <w:lvlText w:val="%1."/>
+      <w:lvlJc w:val="left"/>
+      <w:pPr>
+        <w:ind w:left="720" w:hanging="360"/>
+      </w:pPr>
+    </w:lvl>
+    <w:lvl w:ilvl="1" w:tplc="04100019" w:tentative="1">
+      <w:start w:val="1"/>
+      <w:numFmt w:val="lowerLetter"/>
+      <w:lvlText w:val="%2."/>
+      <w:lvlJc w:val="left"/>
+      <w:pPr>
+        <w:ind w:left="1440" w:hanging="360"/>
+      </w:pPr>
+    </w:lvl>
+    <w:lvl w:ilvl="2" w:tplc="0410001B" w:tentative="1">
+      <w:start w:val="1"/>
+      <w:numFmt w:val="lowerRoman"/>
+      <w:lvlText w:val="%3."/>
+      <w:lvlJc w:val="right"/>
+      <w:pPr>
+        <w:ind w:left="2160" w:hanging="180"/>
+      </w:pPr>
+    </w:lvl>
+    <w:lvl w:ilvl="3" w:tplc="0410000F" w:tentative="1">
+      <w:start w:val="1"/>
+      <w:numFmt w:val="decimal"/>
+      <w:lvlText w:val="%4."/>
+      <w:lvlJc w:val="left"/>
+      <w:pPr>
+        <w:ind w:left="2880" w:hanging="360"/>
+      </w:pPr>
+    </w:lvl>
+    <w:lvl w:ilvl="4" w:tplc="04100019" w:tentative="1">
+      <w:start w:val="1"/>
+      <w:numFmt w:val="lowerLetter"/>
+      <w:lvlText w:val="%5."/>
+      <w:lvlJc w:val="left"/>
+      <w:pPr>
+        <w:ind w:left="3600" w:hanging="360"/>
+      </w:pPr>
+    </w:lvl>
+    <w:lvl w:ilvl="5" w:tplc="0410001B" w:tentative="1">
+      <w:start w:val="1"/>
+      <w:numFmt w:val="lowerRoman"/>
+      <w:lvlText w:val="%6."/>
+      <w:lvlJc w:val="right"/>
+      <w:pPr>
+        <w:ind w:left="4320" w:hanging="180"/>
+      </w:pPr>
+    </w:lvl>
+    <w:lvl w:ilvl="6" w:tplc="0410000F" w:tentative="1">
+      <w:start w:val="1"/>
+      <w:numFmt w:val="decimal"/>
+      <w:lvlText w:val="%7."/>
+      <w:lvlJc w:val="left"/>
+      <w:pPr>
+        <w:ind w:left="5040" w:hanging="360"/>
+      </w:pPr>
+    </w:lvl>
+    <w:lvl w:ilvl="7" w:tplc="04100019" w:tentative="1">
+      <w:start w:val="1"/>
+      <w:numFmt w:val="lowerLetter"/>
+      <w:lvlText w:val="%8."/>
+      <w:lvlJc w:val="left"/>
+      <w:pPr>
+        <w:ind w:left="5760" w:hanging="360"/>
+      </w:pPr>
+    </w:lvl>
+    <w:lvl w:ilvl="8" w:tplc="0410001B" w:tentative="1">
+      <w:start w:val="1"/>
+      <w:numFmt w:val="lowerRoman"/>
+      <w:lvlText w:val="%9."/>
+      <w:lvlJc w:val="right"/>
+      <w:pPr>
+        <w:ind w:left="6480" w:hanging="180"/>
+      </w:pPr>
+    </w:lvl>
+  </w:abstractNum>
+  <w:abstractNum w:abstractNumId="1" w15:restartNumberingAfterBreak="0">
+    <w:nsid w:val="50725A43"/>
+    <w:multiLevelType w:val="hybridMultilevel"/>
+    <w:tmpl w:val="E94A7DE0"/>
+    <w:lvl w:ilvl="0" w:tplc="0410000F">
+      <w:start w:val="1"/>
+      <w:numFmt w:val="decimal"/>
+      <w:lvlText w:val="%1."/>
+      <w:lvlJc w:val="left"/>
+      <w:pPr>
+        <w:ind w:left="720" w:hanging="360"/>
+      </w:pPr>
+    </w:lvl>
+    <w:lvl w:ilvl="1" w:tplc="04100019" w:tentative="1">
+      <w:start w:val="1"/>
+      <w:numFmt w:val="lowerLetter"/>
+      <w:lvlText w:val="%2."/>
+      <w:lvlJc w:val="left"/>
+      <w:pPr>
+        <w:ind w:left="1440" w:hanging="360"/>
+      </w:pPr>
+    </w:lvl>
+    <w:lvl w:ilvl="2" w:tplc="0410001B" w:tentative="1">
+      <w:start w:val="1"/>
+      <w:numFmt w:val="lowerRoman"/>
+      <w:lvlText w:val="%3."/>
+      <w:lvlJc w:val="right"/>
+      <w:pPr>
+        <w:ind w:left="2160" w:hanging="180"/>
+      </w:pPr>
+    </w:lvl>
+    <w:lvl w:ilvl="3" w:tplc="0410000F" w:tentative="1">
+      <w:start w:val="1"/>
+      <w:numFmt w:val="decimal"/>
+      <w:lvlText w:val="%4."/>
+      <w:lvlJc w:val="left"/>
+      <w:pPr>
+        <w:ind w:left="2880" w:hanging="360"/>
+      </w:pPr>
+    </w:lvl>
+    <w:lvl w:ilvl="4" w:tplc="04100019" w:tentative="1">
+      <w:start w:val="1"/>
+      <w:numFmt w:val="lowerLetter"/>
+      <w:lvlText w:val="%5."/>
+      <w:lvlJc w:val="left"/>
+      <w:pPr>
+        <w:ind w:left="3600" w:hanging="360"/>
+      </w:pPr>
+    </w:lvl>
+    <w:lvl w:ilvl="5" w:tplc="0410001B" w:tentative="1">
+      <w:start w:val="1"/>
+      <w:numFmt w:val="lowerRoman"/>
+      <w:lvlText w:val="%6."/>
+      <w:lvlJc w:val="right"/>
+      <w:pPr>
+        <w:ind w:left="4320" w:hanging="180"/>
+      </w:pPr>
+    </w:lvl>
+    <w:lvl w:ilvl="6" w:tplc="0410000F" w:tentative="1">
+      <w:start w:val="1"/>
+      <w:numFmt w:val="decimal"/>
+      <w:lvlText w:val="%7."/>
+      <w:lvlJc w:val="left"/>
+      <w:pPr>
+        <w:ind w:left="5040" w:hanging="360"/>
+      </w:pPr>
+    </w:lvl>
+    <w:lvl w:ilvl="7" w:tplc="04100019" w:tentative="1">
+      <w:start w:val="1"/>
+      <w:numFmt w:val="lowerLetter"/>
+      <w:lvlText w:val="%8."/>
+      <w:lvlJc w:val="left"/>
+      <w:pPr>
+        <w:ind w:left="5760" w:hanging="360"/>
+      </w:pPr>
+    </w:lvl>
+    <w:lvl w:ilvl="8" w:tplc="0410001B" w:tentative="1">
+      <w:start w:val="1"/>
+      <w:numFmt w:val="lowerRoman"/>
+      <w:lvlText w:val="%9."/>
+      <w:lvlJc w:val="right"/>
+      <w:pPr>
+        <w:ind w:left="6480" w:hanging="180"/>
+      </w:pPr>
+    </w:lvl>
+  </w:abstractNum>
+  <w:abstractNum w:abstractNumId="2" w15:restartNumberingAfterBreak="0">
+    <w:nsid w:val="64E8605F"/>
+    <w:multiLevelType w:val="hybridMultilevel"/>
+    <w:tmpl w:val="CF00EC16"/>
+    <w:lvl w:ilvl="0" w:tplc="FFFFFFFF">
+      <w:start w:val="1"/>
+      <w:numFmt w:val="decimal"/>
+      <w:lvlText w:val="%1."/>
+      <w:lvlJc w:val="left"/>
+      <w:pPr>
+        <w:tabs>
+          <w:tab w:val="num" w:pos="720"/>
+        </w:tabs>
+        <w:ind w:left="720" w:hanging="360"/>
+      </w:pPr>
+    </w:lvl>
+    <w:lvl w:ilvl="1" w:tplc="FFFFFFFF" w:tentative="1">
+      <w:start w:val="1"/>
+      <w:numFmt w:val="decimal"/>
+      <w:lvlText w:val="%2."/>
+      <w:lvlJc w:val="left"/>
+      <w:pPr>
+        <w:tabs>
+          <w:tab w:val="num" w:pos="1440"/>
+        </w:tabs>
+        <w:ind w:left="1440" w:hanging="360"/>
+      </w:pPr>
+    </w:lvl>
+    <w:lvl w:ilvl="2" w:tplc="FFFFFFFF" w:tentative="1">
+      <w:start w:val="1"/>
+      <w:numFmt w:val="decimal"/>
+      <w:lvlText w:val="%3."/>
+      <w:lvlJc w:val="left"/>
+      <w:pPr>
+        <w:tabs>
+          <w:tab w:val="num" w:pos="2160"/>
+        </w:tabs>
+        <w:ind w:left="2160" w:hanging="360"/>
+      </w:pPr>
+    </w:lvl>
+    <w:lvl w:ilvl="3" w:tplc="FFFFFFFF" w:tentative="1">
+      <w:start w:val="1"/>
+      <w:numFmt w:val="decimal"/>
+      <w:lvlText w:val="%4."/>
+      <w:lvlJc w:val="left"/>
+      <w:pPr>
+        <w:tabs>
+          <w:tab w:val="num" w:pos="2880"/>
+        </w:tabs>
+        <w:ind w:left="2880" w:hanging="360"/>
+      </w:pPr>
+    </w:lvl>
+    <w:lvl w:ilvl="4" w:tplc="FFFFFFFF" w:tentative="1">
+      <w:start w:val="1"/>
+      <w:numFmt w:val="decimal"/>
+      <w:lvlText w:val="%5."/>
+      <w:lvlJc w:val="left"/>
+      <w:pPr>
+        <w:tabs>
+          <w:tab w:val="num" w:pos="3600"/>
+        </w:tabs>
+        <w:ind w:left="3600" w:hanging="360"/>
+      </w:pPr>
+    </w:lvl>
+    <w:lvl w:ilvl="5" w:tplc="FFFFFFFF" w:tentative="1">
+      <w:start w:val="1"/>
+      <w:numFmt w:val="decimal"/>
+      <w:lvlText w:val="%6."/>
+      <w:lvlJc w:val="left"/>
+      <w:pPr>
+        <w:tabs>
+          <w:tab w:val="num" w:pos="4320"/>
+        </w:tabs>
+        <w:ind w:left="4320" w:hanging="360"/>
+      </w:pPr>
+    </w:lvl>
+    <w:lvl w:ilvl="6" w:tplc="FFFFFFFF" w:tentative="1">
+      <w:start w:val="1"/>
+      <w:numFmt w:val="decimal"/>
+      <w:lvlText w:val="%7."/>
+      <w:lvlJc w:val="left"/>
+      <w:pPr>
+        <w:tabs>
+          <w:tab w:val="num" w:pos="5040"/>
+        </w:tabs>
+        <w:ind w:left="5040" w:hanging="360"/>
+      </w:pPr>
+    </w:lvl>
+    <w:lvl w:ilvl="7" w:tplc="FFFFFFFF" w:tentative="1">
+      <w:start w:val="1"/>
+      <w:numFmt w:val="decimal"/>
+      <w:lvlText w:val="%8."/>
+      <w:lvlJc w:val="left"/>
+      <w:pPr>
+        <w:tabs>
+          <w:tab w:val="num" w:pos="5760"/>
+        </w:tabs>
+        <w:ind w:left="5760" w:hanging="360"/>
+      </w:pPr>
+    </w:lvl>
+    <w:lvl w:ilvl="8" w:tplc="FFFFFFFF" w:tentative="1">
+      <w:start w:val="1"/>
+      <w:numFmt w:val="decimal"/>
+      <w:lvlText w:val="%9."/>
+      <w:lvlJc w:val="left"/>
+      <w:pPr>
+        <w:tabs>
+          <w:tab w:val="num" w:pos="6480"/>
+        </w:tabs>
+        <w:ind w:left="6480" w:hanging="360"/>
+      </w:pPr>
+    </w:lvl>
+  </w:abstractNum>
+  <w:abstractNum w:abstractNumId="3" w15:restartNumberingAfterBreak="0">
+    <w:nsid w:val="6A7976EA"/>
+    <w:multiLevelType w:val="multilevel"/>
+    <w:tmpl w:val="70AABCC0"/>
+    <w:lvl w:ilvl="0">
+      <w:start w:val="1"/>
+      <w:numFmt w:val="bullet"/>
+      <w:lvlText w:val=""/>
+      <w:lvlJc w:val="left"/>
+      <w:pPr>
+        <w:tabs>
+          <w:tab w:val="num" w:pos="720"/>
+        </w:tabs>
+        <w:ind w:left="720" w:hanging="360"/>
+      </w:pPr>
+      <w:rPr>
+        <w:rFonts w:ascii="Symbol" w:hAnsi="Symbol" w:hint="default"/>
+        <w:sz w:val="20"/>
+      </w:rPr>
+    </w:lvl>
+    <w:lvl w:ilvl="1" w:tentative="1">
+      <w:start w:val="1"/>
+      <w:numFmt w:val="bullet"/>
+      <w:lvlText w:val="o"/>
+      <w:lvlJc w:val="left"/>
+      <w:pPr>
+        <w:tabs>
+          <w:tab w:val="num" w:pos="1440"/>
+        </w:tabs>
+        <w:ind w:left="1440" w:hanging="360"/>
+      </w:pPr>
+      <w:rPr>
+        <w:rFonts w:ascii="Courier New" w:hAnsi="Courier New" w:hint="default"/>
+        <w:sz w:val="20"/>
+      </w:rPr>
+    </w:lvl>
+    <w:lvl w:ilvl="2" w:tentative="1">
+      <w:start w:val="1"/>
+      <w:numFmt w:val="bullet"/>
+      <w:lvlText w:val=""/>
+      <w:lvlJc w:val="left"/>
+      <w:pPr>
+        <w:tabs>
+          <w:tab w:val="num" w:pos="2160"/>
+        </w:tabs>
+        <w:ind w:left="2160" w:hanging="360"/>
+      </w:pPr>
+      <w:rPr>
+        <w:rFonts w:ascii="Wingdings" w:hAnsi="Wingdings" w:hint="default"/>
+        <w:sz w:val="20"/>
+      </w:rPr>
+    </w:lvl>
+    <w:lvl w:ilvl="3" w:tentative="1">
+      <w:start w:val="1"/>
+      <w:numFmt w:val="bullet"/>
+      <w:lvlText w:val=""/>
+      <w:lvlJc w:val="left"/>
+      <w:pPr>
+        <w:tabs>
+          <w:tab w:val="num" w:pos="2880"/>
+        </w:tabs>
+        <w:ind w:left="2880" w:hanging="360"/>
+      </w:pPr>
+      <w:rPr>
+        <w:rFonts w:ascii="Wingdings" w:hAnsi="Wingdings" w:hint="default"/>
+        <w:sz w:val="20"/>
+      </w:rPr>
+    </w:lvl>
+    <w:lvl w:ilvl="4" w:tentative="1">
+      <w:start w:val="1"/>
+      <w:numFmt w:val="bullet"/>
+      <w:lvlText w:val=""/>
+      <w:lvlJc w:val="left"/>
+      <w:pPr>
+        <w:tabs>
+          <w:tab w:val="num" w:pos="3600"/>
+        </w:tabs>
+        <w:ind w:left="3600" w:hanging="360"/>
+      </w:pPr>
+      <w:rPr>
+        <w:rFonts w:ascii="Wingdings" w:hAnsi="Wingdings" w:hint="default"/>
+        <w:sz w:val="20"/>
+      </w:rPr>
+    </w:lvl>
+    <w:lvl w:ilvl="5" w:tentative="1">
+      <w:start w:val="1"/>
+      <w:numFmt w:val="bullet"/>
+      <w:lvlText w:val=""/>
+      <w:lvlJc w:val="left"/>
+      <w:pPr>
+        <w:tabs>
+          <w:tab w:val="num" w:pos="4320"/>
+        </w:tabs>
+        <w:ind w:left="4320" w:hanging="360"/>
+      </w:pPr>
+      <w:rPr>
+        <w:rFonts w:ascii="Wingdings" w:hAnsi="Wingdings" w:hint="default"/>
+        <w:sz w:val="20"/>
+      </w:rPr>
+    </w:lvl>
+    <w:lvl w:ilvl="6" w:tentative="1">
+      <w:start w:val="1"/>
+      <w:numFmt w:val="bullet"/>
+      <w:lvlText w:val=""/>
+      <w:lvlJc w:val="left"/>
+      <w:pPr>
+        <w:tabs>
+          <w:tab w:val="num" w:pos="5040"/>
+        </w:tabs>
+        <w:ind w:left="5040" w:hanging="360"/>
+      </w:pPr>
+      <w:rPr>
+        <w:rFonts w:ascii="Wingdings" w:hAnsi="Wingdings" w:hint="default"/>
+        <w:sz w:val="20"/>
+      </w:rPr>
+    </w:lvl>
+    <w:lvl w:ilvl="7" w:tentative="1">
+      <w:start w:val="1"/>
+      <w:numFmt w:val="bullet"/>
+      <w:lvlText w:val=""/>
+      <w:lvlJc w:val="left"/>
+      <w:pPr>
+        <w:tabs>
+          <w:tab w:val="num" w:pos="5760"/>
+        </w:tabs>
+        <w:ind w:left="5760" w:hanging="360"/>
+      </w:pPr>
+      <w:rPr>
+        <w:rFonts w:ascii="Wingdings" w:hAnsi="Wingdings" w:hint="default"/>
+        <w:sz w:val="20"/>
+      </w:rPr>
+    </w:lvl>
+    <w:lvl w:ilvl="8" w:tentative="1">
+      <w:start w:val="1"/>
+      <w:numFmt w:val="bullet"/>
+      <w:lvlText w:val=""/>
+      <w:lvlJc w:val="left"/>
+      <w:pPr>
+        <w:tabs>
+          <w:tab w:val="num" w:pos="6480"/>
+        </w:tabs>
+        <w:ind w:left="6480" w:hanging="360"/>
+      </w:pPr>
+      <w:rPr>
+        <w:rFonts w:ascii="Wingdings" w:hAnsi="Wingdings" w:hint="default"/>
+        <w:sz w:val="20"/>
+      </w:rPr>
+    </w:lvl>
+  </w:abstractNum>
+  <w:abstractNum w:abstractNumId="4" w15:restartNumberingAfterBreak="0">
+    <w:nsid w:val="6EEE6A3E"/>
+    <w:multiLevelType w:val="hybridMultilevel"/>
+    <w:tmpl w:val="A0569EBC"/>
+    <w:lvl w:ilvl="0" w:tplc="0410000F">
+      <w:start w:val="1"/>
+      <w:numFmt w:val="decimal"/>
+      <w:lvlText w:val="%1."/>
+      <w:lvlJc w:val="left"/>
+      <w:pPr>
+        <w:ind w:left="720" w:hanging="360"/>
+      </w:pPr>
+      <w:rPr>
+        <w:rFonts w:hint="default"/>
+      </w:rPr>
+    </w:lvl>
+    <w:lvl w:ilvl="1" w:tplc="FFFFFFFF" w:tentative="1">
+      <w:start w:val="1"/>
+      <w:numFmt w:val="bullet"/>
+      <w:lvlText w:val="o"/>
+      <w:lvlJc w:val="left"/>
+      <w:pPr>
+        <w:ind w:left="1440" w:hanging="360"/>
+      </w:pPr>
+      <w:rPr>
+        <w:rFonts w:ascii="Courier New" w:hAnsi="Courier New" w:cs="Courier New" w:hint="default"/>
+      </w:rPr>
+    </w:lvl>
+    <w:lvl w:ilvl="2" w:tplc="FFFFFFFF" w:tentative="1">
+      <w:start w:val="1"/>
+      <w:numFmt w:val="bullet"/>
+      <w:lvlText w:val=""/>
+      <w:lvlJc w:val="left"/>
+      <w:pPr>
+        <w:ind w:left="2160" w:hanging="360"/>
+      </w:pPr>
+      <w:rPr>
+        <w:rFonts w:ascii="Wingdings" w:hAnsi="Wingdings" w:hint="default"/>
+      </w:rPr>
+    </w:lvl>
+    <w:lvl w:ilvl="3" w:tplc="FFFFFFFF" w:tentative="1">
+      <w:start w:val="1"/>
+      <w:numFmt w:val="bullet"/>
+      <w:lvlText w:val=""/>
+      <w:lvlJc w:val="left"/>
+      <w:pPr>
+        <w:ind w:left="2880" w:hanging="360"/>
+      </w:pPr>
+      <w:rPr>
+        <w:rFonts w:ascii="Symbol" w:hAnsi="Symbol" w:hint="default"/>
+      </w:rPr>
+    </w:lvl>
+    <w:lvl w:ilvl="4" w:tplc="FFFFFFFF" w:tentative="1">
+      <w:start w:val="1"/>
+      <w:numFmt w:val="bullet"/>
+      <w:lvlText w:val="o"/>
+      <w:lvlJc w:val="left"/>
+      <w:pPr>
+        <w:ind w:left="3600" w:hanging="360"/>
+      </w:pPr>
+      <w:rPr>
+        <w:rFonts w:ascii="Courier New" w:hAnsi="Courier New" w:cs="Courier New" w:hint="default"/>
+      </w:rPr>
+    </w:lvl>
+    <w:lvl w:ilvl="5" w:tplc="FFFFFFFF" w:tentative="1">
+      <w:start w:val="1"/>
+      <w:numFmt w:val="bullet"/>
+      <w:lvlText w:val=""/>
+      <w:lvlJc w:val="left"/>
+      <w:pPr>
+        <w:ind w:left="4320" w:hanging="360"/>
+      </w:pPr>
+      <w:rPr>
+        <w:rFonts w:ascii="Wingdings" w:hAnsi="Wingdings" w:hint="default"/>
+      </w:rPr>
+    </w:lvl>
+    <w:lvl w:ilvl="6" w:tplc="FFFFFFFF" w:tentative="1">
+      <w:start w:val="1"/>
+      <w:numFmt w:val="bullet"/>
+      <w:lvlText w:val=""/>
+      <w:lvlJc w:val="left"/>
+      <w:pPr>
+        <w:ind w:left="5040" w:hanging="360"/>
+      </w:pPr>
+      <w:rPr>
+        <w:rFonts w:ascii="Symbol" w:hAnsi="Symbol" w:hint="default"/>
+      </w:rPr>
+    </w:lvl>
+    <w:lvl w:ilvl="7" w:tplc="FFFFFFFF" w:tentative="1">
+      <w:start w:val="1"/>
+      <w:numFmt w:val="bullet"/>
+      <w:lvlText w:val="o"/>
+      <w:lvlJc w:val="left"/>
+      <w:pPr>
+        <w:ind w:left="5760" w:hanging="360"/>
+      </w:pPr>
+      <w:rPr>
+        <w:rFonts w:ascii="Courier New" w:hAnsi="Courier New" w:cs="Courier New" w:hint="default"/>
+      </w:rPr>
+    </w:lvl>
+    <w:lvl w:ilvl="8" w:tplc="FFFFFFFF" w:tentative="1">
+      <w:start w:val="1"/>
+      <w:numFmt w:val="bullet"/>
+      <w:lvlText w:val=""/>
+      <w:lvlJc w:val="left"/>
+      <w:pPr>
+        <w:ind w:left="6480" w:hanging="360"/>
+      </w:pPr>
+      <w:rPr>
+        <w:rFonts w:ascii="Wingdings" w:hAnsi="Wingdings" w:hint="default"/>
+      </w:rPr>
+    </w:lvl>
+  </w:abstractNum>
+  <w:num w:numId="1" w16cid:durableId="1149057099">
+    <w:abstractNumId w:val="0"/>
+  </w:num>
+  <w:num w:numId="2" w16cid:durableId="1653562118">
+    <w:abstractNumId w:val="3"/>
+  </w:num>
+  <w:num w:numId="3" w16cid:durableId="1871526438">
+    <w:abstractNumId w:val="2"/>
+  </w:num>
+  <w:num w:numId="4" w16cid:durableId="582180998">
+    <w:abstractNumId w:val="1"/>
+  </w:num>
+  <w:num w:numId="5" w16cid:durableId="719092602">
+    <w:abstractNumId w:val="4"/>
+  </w:num>
+</w:numbering>
+</file>
+
+<file path=word/people.xml><?xml version="1.0" encoding="utf-8"?>
+<w15:people xmlns:wpc="http://schemas.microsoft.com/office/word/2010/wordprocessingCanvas" xmlns:cx="http://schemas.microsoft.com/office/drawing/2014/chartex" xmlns:cx1="http://schemas.microsoft.com/office/drawing/2015/9/8/chartex" xmlns:cx2="http://schemas.microsoft.com/office/drawing/2015/10/21/chartex" xmlns:cx3="http://schemas.microsoft.com/office/drawing/2016/5/9/chartex" xmlns:cx4="http://schemas.microsoft.com/office/drawing/2016/5/10/chartex" xmlns:cx5="http://schemas.microsoft.com/office/drawing/2016/5/11/chartex" xmlns:cx6="http://schemas.microsoft.com/office/drawing/2016/5/12/chartex" xmlns:cx7="http://schemas.microsoft.com/office/drawing/2016/5/13/chartex" xmlns:cx8="http://schemas.microsoft.com/office/drawing/2016/5/14/chartex" xmlns:mc="http://schemas.openxmlformats.org/markup-compatibility/2006" xmlns:aink="http://schemas.microsoft.com/office/drawing/2016/ink" xmlns:am3d="http://schemas.microsoft.com/office/drawing/2017/model3d" xmlns:o="urn:schemas-microsoft-com:office:office" xmlns:oel="http://schemas.microsoft.com/office/2019/extlst" xmlns:r="http://schemas.openxmlformats.org/officeDocument/2006/relationships" xmlns:m="http://schemas.openxmlformats.org/officeDocument/2006/math" xmlns:v="urn:schemas-microsoft-com:vml" xmlns:wp14="http://schemas.microsoft.com/office/word/2010/wordprocessingDrawing" xmlns:wp="http://schemas.openxmlformats.org/drawingml/2006/wordprocessingDrawing" xmlns:w10="urn:schemas-microsoft-com:office:word" xmlns:w="http://schemas.openxmlformats.org/wordprocessingml/2006/main" xmlns:w14="http://schemas.microsoft.com/office/word/2010/wordml" xmlns:w15="http://schemas.microsoft.com/office/word/2012/wordml" xmlns:w16cex="http://schemas.microsoft.com/office/word/2018/wordml/cex" xmlns:w16cid="http://schemas.microsoft.com/office/word/2016/wordml/cid" xmlns:w16="http://schemas.microsoft.com/office/word/2018/wordml" xmlns:w16du="http://schemas.microsoft.com/office/word/2023/wordml/word16du" xmlns:w16sdtdh="http://schemas.microsoft.com/office/word/2020/wordml/sdtdatahash" xmlns:w16se="http://schemas.microsoft.com/office/word/2015/wordml/symex" xmlns:wpg="http://schemas.microsoft.com/office/word/2010/wordprocessingGroup" xmlns:wpi="http://schemas.microsoft.com/office/word/2010/wordprocessingInk" xmlns:wne="http://schemas.microsoft.com/office/word/2006/wordml" xmlns:wps="http://schemas.microsoft.com/office/word/2010/wordprocessingShape" mc:Ignorable="w14 w15 w16se w16cid w16 w16cex w16sdtdh w16du wp14">
+  <w15:person w15:author="Giorgio Alberto Ubbiali">
+    <w15:presenceInfo w15:providerId="AD" w15:userId="S::giorgio.ubbiali@unimi.it::98cd51e1-85a8-4254-8a78-75df2af85e2d"/>
+  </w15:person>
+</w15:people>
 </file>
 
 <file path=word/styles.xml><?xml version="1.0" encoding="utf-8"?>
@@ -458,7 +3262,6 @@
     <w:next w:val="Normale"/>
     <w:link w:val="Titolo2Carattere"/>
     <w:uiPriority w:val="9"/>
-    <w:semiHidden/>
     <w:unhideWhenUsed/>
     <w:qFormat/>
     <w:rsid w:val="00506FBD"/>
@@ -633,7 +3436,6 @@
   <w:style w:type="character" w:default="1" w:styleId="Carpredefinitoparagrafo">
     <w:name w:val="Default Paragraph Font"/>
     <w:uiPriority w:val="1"/>
-    <w:semiHidden/>
     <w:unhideWhenUsed/>
   </w:style>
   <w:style w:type="table" w:default="1" w:styleId="Tabellanormale">
@@ -675,7 +3477,6 @@
     <w:basedOn w:val="Carpredefinitoparagrafo"/>
     <w:link w:val="Titolo2"/>
     <w:uiPriority w:val="9"/>
-    <w:semiHidden/>
     <w:rsid w:val="00506FBD"/>
     <w:rPr>
       <w:rFonts w:asciiTheme="majorHAnsi" w:eastAsiaTheme="majorEastAsia" w:hAnsiTheme="majorHAnsi" w:cstheme="majorBidi"/>
@@ -945,6 +3746,117 @@
       <w:smallCaps/>
       <w:color w:val="0F4761" w:themeColor="accent1" w:themeShade="BF"/>
       <w:spacing w:val="5"/>
+    </w:rPr>
+  </w:style>
+  <w:style w:type="character" w:styleId="Collegamentoipertestuale">
+    <w:name w:val="Hyperlink"/>
+    <w:basedOn w:val="Carpredefinitoparagrafo"/>
+    <w:uiPriority w:val="99"/>
+    <w:unhideWhenUsed/>
+    <w:rsid w:val="003B1583"/>
+    <w:rPr>
+      <w:color w:val="467886" w:themeColor="hyperlink"/>
+      <w:u w:val="single"/>
+    </w:rPr>
+  </w:style>
+  <w:style w:type="character" w:styleId="Menzionenonrisolta">
+    <w:name w:val="Unresolved Mention"/>
+    <w:basedOn w:val="Carpredefinitoparagrafo"/>
+    <w:uiPriority w:val="99"/>
+    <w:semiHidden/>
+    <w:unhideWhenUsed/>
+    <w:rsid w:val="003B1583"/>
+    <w:rPr>
+      <w:color w:val="605E5C"/>
+      <w:shd w:val="clear" w:color="auto" w:fill="E1DFDD"/>
+    </w:rPr>
+  </w:style>
+  <w:style w:type="character" w:styleId="Collegamentovisitato">
+    <w:name w:val="FollowedHyperlink"/>
+    <w:basedOn w:val="Carpredefinitoparagrafo"/>
+    <w:uiPriority w:val="99"/>
+    <w:semiHidden/>
+    <w:unhideWhenUsed/>
+    <w:rsid w:val="003B1583"/>
+    <w:rPr>
+      <w:color w:val="96607D" w:themeColor="followedHyperlink"/>
+      <w:u w:val="single"/>
+    </w:rPr>
+  </w:style>
+  <w:style w:type="paragraph" w:styleId="Bibliografia">
+    <w:name w:val="Bibliography"/>
+    <w:basedOn w:val="Normale"/>
+    <w:next w:val="Normale"/>
+    <w:uiPriority w:val="37"/>
+    <w:unhideWhenUsed/>
+    <w:rsid w:val="0099723A"/>
+  </w:style>
+  <w:style w:type="character" w:styleId="Rimandocommento">
+    <w:name w:val="annotation reference"/>
+    <w:basedOn w:val="Carpredefinitoparagrafo"/>
+    <w:uiPriority w:val="99"/>
+    <w:semiHidden/>
+    <w:unhideWhenUsed/>
+    <w:rsid w:val="00E82B4A"/>
+    <w:rPr>
+      <w:sz w:val="16"/>
+      <w:szCs w:val="16"/>
+    </w:rPr>
+  </w:style>
+  <w:style w:type="paragraph" w:styleId="Testocommento">
+    <w:name w:val="annotation text"/>
+    <w:basedOn w:val="Normale"/>
+    <w:link w:val="TestocommentoCarattere"/>
+    <w:uiPriority w:val="99"/>
+    <w:semiHidden/>
+    <w:unhideWhenUsed/>
+    <w:rsid w:val="00E82B4A"/>
+    <w:pPr>
+      <w:spacing w:line="240" w:lineRule="auto"/>
+    </w:pPr>
+    <w:rPr>
+      <w:sz w:val="20"/>
+      <w:szCs w:val="20"/>
+    </w:rPr>
+  </w:style>
+  <w:style w:type="character" w:customStyle="1" w:styleId="TestocommentoCarattere">
+    <w:name w:val="Testo commento Carattere"/>
+    <w:basedOn w:val="Carpredefinitoparagrafo"/>
+    <w:link w:val="Testocommento"/>
+    <w:uiPriority w:val="99"/>
+    <w:semiHidden/>
+    <w:rsid w:val="00E82B4A"/>
+    <w:rPr>
+      <w:sz w:val="20"/>
+      <w:szCs w:val="20"/>
+    </w:rPr>
+  </w:style>
+  <w:style w:type="paragraph" w:styleId="Soggettocommento">
+    <w:name w:val="annotation subject"/>
+    <w:basedOn w:val="Testocommento"/>
+    <w:next w:val="Testocommento"/>
+    <w:link w:val="SoggettocommentoCarattere"/>
+    <w:uiPriority w:val="99"/>
+    <w:semiHidden/>
+    <w:unhideWhenUsed/>
+    <w:rsid w:val="00E82B4A"/>
+    <w:rPr>
+      <w:b/>
+      <w:bCs/>
+    </w:rPr>
+  </w:style>
+  <w:style w:type="character" w:customStyle="1" w:styleId="SoggettocommentoCarattere">
+    <w:name w:val="Soggetto commento Carattere"/>
+    <w:basedOn w:val="TestocommentoCarattere"/>
+    <w:link w:val="Soggettocommento"/>
+    <w:uiPriority w:val="99"/>
+    <w:semiHidden/>
+    <w:rsid w:val="00E82B4A"/>
+    <w:rPr>
+      <w:b/>
+      <w:bCs/>
+      <w:sz w:val="20"/>
+      <w:szCs w:val="20"/>
     </w:rPr>
   </w:style>
 </w:styles>

</xml_diff>